<commit_message>
modify: add explanation for logistic regression
</commit_message>
<xml_diff>
--- a/documents/הצעת המחקר .docx
+++ b/documents/הצעת המחקר .docx
@@ -16,6 +16,7 @@
       <w:r>
         <w:rPr>
           <w:rFonts w:asciiTheme="minorBidi" w:eastAsia="Alef" w:hAnsiTheme="minorBidi" w:cstheme="minorBidi"/>
+          <w:noProof/>
           <w:sz w:val="36"/>
           <w:szCs w:val="36"/>
           <w:shd w:val="clear" w:color="auto" w:fill="F8F9FA"/>
@@ -1301,16 +1302,7 @@
                 <w:noProof/>
                 <w:rtl/>
               </w:rPr>
-              <w:t>ה</w:t>
-            </w:r>
-            <w:r>
-              <w:rPr>
-                <w:rStyle w:val="Hyperlink"/>
-                <w:rFonts w:hint="eastAsia"/>
-                <w:noProof/>
-                <w:rtl/>
-              </w:rPr>
-              <w:t>גדרת</w:t>
+              <w:t>הגדרת</w:t>
             </w:r>
             <w:r>
               <w:rPr>
@@ -1447,25 +1439,7 @@
                 <w:noProof/>
                 <w:rtl/>
               </w:rPr>
-              <w:t>לפונק</w:t>
-            </w:r>
-            <w:r>
-              <w:rPr>
-                <w:rStyle w:val="Hyperlink"/>
-                <w:rFonts w:hint="eastAsia"/>
-                <w:noProof/>
-                <w:rtl/>
-              </w:rPr>
-              <w:t>צ</w:t>
-            </w:r>
-            <w:r>
-              <w:rPr>
-                <w:rStyle w:val="Hyperlink"/>
-                <w:rFonts w:hint="eastAsia"/>
-                <w:noProof/>
-                <w:rtl/>
-              </w:rPr>
-              <w:t>יות</w:t>
+              <w:t>לפונקציות</w:t>
             </w:r>
             <w:r>
               <w:rPr>
@@ -2166,54 +2140,7 @@
       <w:pPr>
         <w:bidi/>
         <w:rPr>
-          <w:rFonts w:asciiTheme="minorBidi" w:eastAsia="Alef" w:hAnsiTheme="minorBidi" w:cstheme="minorBidi"/>
-          <w:sz w:val="36"/>
-          <w:szCs w:val="36"/>
-          <w:shd w:val="clear" w:color="auto" w:fill="F8F9FA"/>
-          <w:rtl/>
-        </w:rPr>
-      </w:pPr>
-    </w:p>
-    <w:p>
-      <w:pPr>
-        <w:bidi/>
-        <w:rPr>
-          <w:rFonts w:asciiTheme="minorBidi" w:eastAsia="Alef" w:hAnsiTheme="minorBidi" w:cstheme="minorBidi"/>
-          <w:sz w:val="36"/>
-          <w:szCs w:val="36"/>
-          <w:shd w:val="clear" w:color="auto" w:fill="F8F9FA"/>
-        </w:rPr>
-      </w:pPr>
-    </w:p>
-    <w:p>
-      <w:pPr>
-        <w:bidi/>
-        <w:rPr>
-          <w:rFonts w:asciiTheme="minorBidi" w:eastAsia="Alef" w:hAnsiTheme="minorBidi" w:cstheme="minorBidi"/>
-          <w:sz w:val="36"/>
-          <w:szCs w:val="36"/>
-          <w:shd w:val="clear" w:color="auto" w:fill="F8F9FA"/>
-          <w:rtl/>
-        </w:rPr>
-      </w:pPr>
-    </w:p>
-    <w:p>
-      <w:pPr>
-        <w:bidi/>
-        <w:rPr>
-          <w:rFonts w:asciiTheme="minorBidi" w:eastAsia="Alef" w:hAnsiTheme="minorBidi" w:cstheme="minorBidi"/>
-          <w:sz w:val="36"/>
-          <w:szCs w:val="36"/>
-          <w:shd w:val="clear" w:color="auto" w:fill="F8F9FA"/>
-          <w:rtl/>
-        </w:rPr>
-      </w:pPr>
-    </w:p>
-    <w:p>
-      <w:pPr>
-        <w:bidi/>
-        <w:rPr>
-          <w:rFonts w:asciiTheme="minorBidi" w:eastAsia="Alef" w:hAnsiTheme="minorBidi" w:cstheme="minorBidi"/>
+          <w:rFonts w:asciiTheme="minorBidi" w:eastAsia="Alef" w:hAnsiTheme="minorBidi" w:cstheme="minorBidi" w:hint="cs"/>
           <w:sz w:val="28"/>
           <w:szCs w:val="28"/>
           <w:shd w:val="clear" w:color="auto" w:fill="F8F9FA"/>
@@ -2241,6 +2168,7 @@
           <w:rtl/>
           <w:lang w:val="en-US"/>
         </w:rPr>
+        <w:lastRenderedPageBreak/>
         <w:t>נושא העבודה</w:t>
       </w:r>
       <w:bookmarkEnd w:id="2"/>
@@ -2673,17 +2601,7 @@
           <w:rtl/>
           <w:lang w:val="en-US"/>
         </w:rPr>
-        <w:t>ב</w:t>
-      </w:r>
-      <w:r>
-        <w:rPr>
-          <w:rFonts w:asciiTheme="minorBidi" w:hAnsiTheme="minorBidi" w:cstheme="minorBidi"/>
-          <w:sz w:val="28"/>
-          <w:szCs w:val="28"/>
-          <w:rtl/>
-          <w:lang w:val="en-US"/>
-        </w:rPr>
-        <w:t>דומיינים פונקציונליים</w:t>
+        <w:t>בדומיינים פונקציונליים</w:t>
       </w:r>
       <w:r>
         <w:rPr>
@@ -2726,17 +2644,7 @@
           <w:rtl/>
           <w:lang w:val="en-US"/>
         </w:rPr>
-        <w:t>ב</w:t>
-      </w:r>
-      <w:r>
-        <w:rPr>
-          <w:rFonts w:asciiTheme="minorBidi" w:hAnsiTheme="minorBidi" w:cstheme="minorBidi"/>
-          <w:sz w:val="28"/>
-          <w:szCs w:val="28"/>
-          <w:rtl/>
-          <w:lang w:val="en-US"/>
-        </w:rPr>
-        <w:t>דומיינים פונקציונליים</w:t>
+        <w:t>בדומיינים פונקציונליים</w:t>
       </w:r>
       <w:r>
         <w:rPr>
@@ -2848,37 +2756,15 @@
         </w:rPr>
         <w:t xml:space="preserve"> מתפקדים כמתגים ביולוגיים שאחראים על העברת אותות לצמיחת התא. המוטציות נוטות להופיע בדומיינים שאחראים על כיבוי המתג או על הפעלתו (כמו דומיין ה-</w:t>
       </w:r>
-      <w:proofErr w:type="spellStart"/>
-      <w:r>
-        <w:rPr>
-          <w:rFonts w:asciiTheme="minorBidi" w:hAnsiTheme="minorBidi" w:cstheme="minorBidi"/>
-          <w:sz w:val="28"/>
-          <w:szCs w:val="28"/>
-          <w:shd w:val="clear" w:color="auto" w:fill="F8F9FA"/>
-        </w:rPr>
-        <w:t>Tyrosine</w:t>
-      </w:r>
-      <w:proofErr w:type="spellEnd"/>
-      <w:r>
-        <w:rPr>
-          <w:rFonts w:asciiTheme="minorBidi" w:hAnsiTheme="minorBidi" w:cstheme="minorBidi"/>
-          <w:sz w:val="28"/>
-          <w:szCs w:val="28"/>
-          <w:shd w:val="clear" w:color="auto" w:fill="F8F9FA"/>
-        </w:rPr>
-        <w:t xml:space="preserve"> </w:t>
-      </w:r>
-      <w:proofErr w:type="spellStart"/>
-      <w:r>
-        <w:rPr>
-          <w:rFonts w:asciiTheme="minorBidi" w:hAnsiTheme="minorBidi" w:cstheme="minorBidi"/>
-          <w:sz w:val="28"/>
-          <w:szCs w:val="28"/>
-          <w:shd w:val="clear" w:color="auto" w:fill="F8F9FA"/>
-        </w:rPr>
-        <w:t>Kinase</w:t>
-      </w:r>
-      <w:proofErr w:type="spellEnd"/>
+      <w:r>
+        <w:rPr>
+          <w:rFonts w:asciiTheme="minorBidi" w:hAnsiTheme="minorBidi" w:cstheme="minorBidi"/>
+          <w:sz w:val="28"/>
+          <w:szCs w:val="28"/>
+          <w:shd w:val="clear" w:color="auto" w:fill="F8F9FA"/>
+        </w:rPr>
+        <w:t>Tyrosine Kinase</w:t>
+      </w:r>
       <w:r>
         <w:rPr>
           <w:rFonts w:asciiTheme="minorBidi" w:hAnsiTheme="minorBidi" w:cstheme="minorBidi"/>
@@ -2946,7 +2832,6 @@
         </w:rPr>
         <w:t>). כאשר מתרחשת מוטציה בדיוק באזורים הרגישים הללו, המבנה המרחבי של החלבון משתנה כך שהוא נתקע במצב "פועל" (</w:t>
       </w:r>
-      <w:proofErr w:type="spellStart"/>
       <w:r>
         <w:rPr>
           <w:rFonts w:asciiTheme="minorBidi" w:hAnsiTheme="minorBidi" w:cstheme="minorBidi"/>
@@ -2956,7 +2841,6 @@
         </w:rPr>
         <w:t>On</w:t>
       </w:r>
-      <w:proofErr w:type="spellEnd"/>
       <w:r>
         <w:rPr>
           <w:rFonts w:asciiTheme="minorBidi" w:hAnsiTheme="minorBidi" w:cstheme="minorBidi"/>
@@ -2990,7 +2874,6 @@
           <w:bCs/>
           <w:color w:val="000000"/>
         </w:rPr>
-        <w:lastRenderedPageBreak/>
         <w:t>KRAS</w:t>
       </w:r>
       <w:bookmarkEnd w:id="8"/>
@@ -3027,7 +2910,6 @@
         </w:rPr>
         <w:t xml:space="preserve"> הוא </w:t>
       </w:r>
-      <w:proofErr w:type="spellStart"/>
       <w:r>
         <w:rPr>
           <w:sz w:val="28"/>
@@ -3035,32 +2917,13 @@
         </w:rPr>
         <w:t>GTPase</w:t>
       </w:r>
-      <w:proofErr w:type="spellEnd"/>
-      <w:r>
-        <w:rPr>
-          <w:sz w:val="28"/>
-          <w:szCs w:val="28"/>
-          <w:rtl/>
-        </w:rPr>
-        <w:t xml:space="preserve"> המעורב בהעברת אותות </w:t>
-      </w:r>
-      <w:proofErr w:type="spellStart"/>
-      <w:r>
-        <w:rPr>
-          <w:sz w:val="28"/>
-          <w:szCs w:val="28"/>
-          <w:rtl/>
-        </w:rPr>
-        <w:t>תוך־תאיים</w:t>
-      </w:r>
-      <w:proofErr w:type="spellEnd"/>
-      <w:r>
-        <w:rPr>
-          <w:sz w:val="28"/>
-          <w:szCs w:val="28"/>
-          <w:rtl/>
-        </w:rPr>
-        <w:t xml:space="preserve"> הקשורים לגדילה וחלוקה.</w:t>
+      <w:r>
+        <w:rPr>
+          <w:sz w:val="28"/>
+          <w:szCs w:val="28"/>
+          <w:rtl/>
+        </w:rPr>
+        <w:t xml:space="preserve"> המעורב בהעברת אותות תוך־תאיים הקשורים לגדילה וחלוקה.</w:t>
       </w:r>
       <w:r>
         <w:rPr>
@@ -3108,23 +2971,15 @@
           <w:szCs w:val="28"/>
           <w:rtl/>
         </w:rPr>
+        <w:lastRenderedPageBreak/>
         <w:t xml:space="preserve">אזורי </w:t>
       </w:r>
-      <w:proofErr w:type="spellStart"/>
-      <w:r>
-        <w:rPr>
-          <w:sz w:val="28"/>
-          <w:szCs w:val="28"/>
-        </w:rPr>
-        <w:t>Switch</w:t>
-      </w:r>
-      <w:proofErr w:type="spellEnd"/>
-      <w:r>
-        <w:rPr>
-          <w:sz w:val="28"/>
-          <w:szCs w:val="28"/>
-        </w:rPr>
-        <w:t xml:space="preserve"> I</w:t>
+      <w:r>
+        <w:rPr>
+          <w:sz w:val="28"/>
+          <w:szCs w:val="28"/>
+        </w:rPr>
+        <w:t>Switch I</w:t>
       </w:r>
       <w:r>
         <w:rPr>
@@ -3134,21 +2989,12 @@
         </w:rPr>
         <w:t xml:space="preserve"> ו-</w:t>
       </w:r>
-      <w:proofErr w:type="spellStart"/>
-      <w:r>
-        <w:rPr>
-          <w:sz w:val="28"/>
-          <w:szCs w:val="28"/>
-        </w:rPr>
-        <w:t>Switch</w:t>
-      </w:r>
-      <w:proofErr w:type="spellEnd"/>
-      <w:r>
-        <w:rPr>
-          <w:sz w:val="28"/>
-          <w:szCs w:val="28"/>
-        </w:rPr>
-        <w:t xml:space="preserve"> II</w:t>
+      <w:r>
+        <w:rPr>
+          <w:sz w:val="28"/>
+          <w:szCs w:val="28"/>
+        </w:rPr>
+        <w:t>Switch II</w:t>
       </w:r>
       <w:r>
         <w:rPr>
@@ -3250,85 +3096,15 @@
           <w:szCs w:val="28"/>
           <w:rtl/>
         </w:rPr>
-        <w:t xml:space="preserve"> הוא קולטן </w:t>
-      </w:r>
-      <w:proofErr w:type="spellStart"/>
-      <w:r>
-        <w:rPr>
-          <w:sz w:val="28"/>
-          <w:szCs w:val="28"/>
-          <w:rtl/>
-        </w:rPr>
-        <w:t>טירוזין</w:t>
-      </w:r>
-      <w:proofErr w:type="spellEnd"/>
-      <w:r>
-        <w:rPr>
-          <w:sz w:val="28"/>
-          <w:szCs w:val="28"/>
-          <w:rtl/>
-        </w:rPr>
-        <w:t xml:space="preserve"> </w:t>
-      </w:r>
-      <w:proofErr w:type="spellStart"/>
-      <w:r>
-        <w:rPr>
-          <w:sz w:val="28"/>
-          <w:szCs w:val="28"/>
-          <w:rtl/>
-        </w:rPr>
-        <w:t>קינאז</w:t>
-      </w:r>
-      <w:proofErr w:type="spellEnd"/>
-      <w:r>
-        <w:rPr>
-          <w:sz w:val="28"/>
-          <w:szCs w:val="28"/>
-          <w:rtl/>
-        </w:rPr>
-        <w:t xml:space="preserve"> (</w:t>
-      </w:r>
-      <w:proofErr w:type="spellStart"/>
-      <w:r>
-        <w:rPr>
-          <w:sz w:val="28"/>
-          <w:szCs w:val="28"/>
-        </w:rPr>
-        <w:t>Receptor</w:t>
-      </w:r>
-      <w:proofErr w:type="spellEnd"/>
-      <w:r>
-        <w:rPr>
-          <w:sz w:val="28"/>
-          <w:szCs w:val="28"/>
-        </w:rPr>
-        <w:t xml:space="preserve"> </w:t>
-      </w:r>
-      <w:proofErr w:type="spellStart"/>
-      <w:r>
-        <w:rPr>
-          <w:sz w:val="28"/>
-          <w:szCs w:val="28"/>
-        </w:rPr>
-        <w:t>Tyrosine</w:t>
-      </w:r>
-      <w:proofErr w:type="spellEnd"/>
-      <w:r>
-        <w:rPr>
-          <w:sz w:val="28"/>
-          <w:szCs w:val="28"/>
-        </w:rPr>
-        <w:t xml:space="preserve"> </w:t>
-      </w:r>
-      <w:proofErr w:type="spellStart"/>
-      <w:r>
-        <w:rPr>
-          <w:sz w:val="28"/>
-          <w:szCs w:val="28"/>
-        </w:rPr>
-        <w:t>Kinase</w:t>
-      </w:r>
-      <w:proofErr w:type="spellEnd"/>
+        <w:t xml:space="preserve"> הוא קולטן טירוזין קינאז (</w:t>
+      </w:r>
+      <w:r>
+        <w:rPr>
+          <w:sz w:val="28"/>
+          <w:szCs w:val="28"/>
+        </w:rPr>
+        <w:t>Receptor Tyrosine Kinase</w:t>
+      </w:r>
       <w:r>
         <w:rPr>
           <w:sz w:val="28"/>
@@ -3352,126 +3128,60 @@
           <w:szCs w:val="28"/>
           <w:rtl/>
         </w:rPr>
-        <w:t xml:space="preserve">הוא כולל מספר </w:t>
-      </w:r>
-      <w:proofErr w:type="spellStart"/>
-      <w:r>
-        <w:rPr>
-          <w:sz w:val="28"/>
-          <w:szCs w:val="28"/>
-          <w:rtl/>
-        </w:rPr>
-        <w:t>דומיינים</w:t>
-      </w:r>
-      <w:proofErr w:type="spellEnd"/>
-      <w:r>
-        <w:rPr>
-          <w:sz w:val="28"/>
-          <w:szCs w:val="28"/>
-          <w:rtl/>
-        </w:rPr>
-        <w:t>:</w:t>
-      </w:r>
-    </w:p>
-    <w:p>
-      <w:pPr>
-        <w:bidi/>
-        <w:rPr>
-          <w:sz w:val="28"/>
-          <w:szCs w:val="28"/>
-        </w:rPr>
-      </w:pPr>
-      <w:r>
-        <w:rPr>
-          <w:sz w:val="28"/>
-          <w:szCs w:val="28"/>
-          <w:rtl/>
-        </w:rPr>
-        <w:t xml:space="preserve">דומיין חוץ-תאי לקישור </w:t>
-      </w:r>
-      <w:proofErr w:type="spellStart"/>
-      <w:r>
-        <w:rPr>
-          <w:sz w:val="28"/>
-          <w:szCs w:val="28"/>
-          <w:rtl/>
-        </w:rPr>
-        <w:t>ליגנד</w:t>
-      </w:r>
-      <w:proofErr w:type="spellEnd"/>
-    </w:p>
-    <w:p>
-      <w:pPr>
-        <w:bidi/>
-        <w:rPr>
-          <w:sz w:val="28"/>
-          <w:szCs w:val="28"/>
-        </w:rPr>
-      </w:pPr>
-      <w:r>
-        <w:rPr>
-          <w:sz w:val="28"/>
-          <w:szCs w:val="28"/>
-          <w:rtl/>
-        </w:rPr>
-        <w:t xml:space="preserve">דומיין </w:t>
-      </w:r>
-      <w:proofErr w:type="spellStart"/>
-      <w:r>
-        <w:rPr>
-          <w:sz w:val="28"/>
-          <w:szCs w:val="28"/>
-          <w:rtl/>
-        </w:rPr>
-        <w:t>טרנסממברנלי</w:t>
-      </w:r>
-      <w:proofErr w:type="spellEnd"/>
-    </w:p>
-    <w:p>
-      <w:pPr>
-        <w:bidi/>
-        <w:rPr>
-          <w:sz w:val="28"/>
-          <w:szCs w:val="28"/>
-          <w:rtl/>
-        </w:rPr>
-      </w:pPr>
-      <w:r>
-        <w:rPr>
-          <w:sz w:val="28"/>
-          <w:szCs w:val="28"/>
-          <w:rtl/>
-        </w:rPr>
-        <w:t xml:space="preserve">דומיין </w:t>
-      </w:r>
-      <w:proofErr w:type="spellStart"/>
-      <w:r>
-        <w:rPr>
-          <w:sz w:val="28"/>
-          <w:szCs w:val="28"/>
-          <w:rtl/>
-        </w:rPr>
-        <w:t>קינאז</w:t>
-      </w:r>
-      <w:proofErr w:type="spellEnd"/>
-      <w:r>
-        <w:rPr>
-          <w:sz w:val="28"/>
-          <w:szCs w:val="28"/>
-          <w:rtl/>
-        </w:rPr>
-        <w:t xml:space="preserve"> </w:t>
-      </w:r>
-      <w:proofErr w:type="spellStart"/>
-      <w:r>
-        <w:rPr>
-          <w:sz w:val="28"/>
-          <w:szCs w:val="28"/>
-          <w:rtl/>
-        </w:rPr>
-        <w:t>תוך־תאי</w:t>
-      </w:r>
-      <w:proofErr w:type="spellEnd"/>
+        <w:t>הוא כולל מספר דומיינים:</w:t>
+      </w:r>
+    </w:p>
+    <w:p>
+      <w:pPr>
+        <w:bidi/>
+        <w:rPr>
+          <w:sz w:val="28"/>
+          <w:szCs w:val="28"/>
+        </w:rPr>
+      </w:pPr>
+      <w:r>
+        <w:rPr>
+          <w:sz w:val="28"/>
+          <w:szCs w:val="28"/>
+          <w:rtl/>
+        </w:rPr>
+        <w:t>דומיין חוץ-תאי לקישור ליגנד</w:t>
+      </w:r>
+    </w:p>
+    <w:p>
+      <w:pPr>
+        <w:bidi/>
+        <w:rPr>
+          <w:sz w:val="28"/>
+          <w:szCs w:val="28"/>
+        </w:rPr>
+      </w:pPr>
+      <w:r>
+        <w:rPr>
+          <w:sz w:val="28"/>
+          <w:szCs w:val="28"/>
+          <w:rtl/>
+        </w:rPr>
+        <w:t>דומיין טרנסממברנלי</w:t>
+      </w:r>
+    </w:p>
+    <w:p>
+      <w:pPr>
+        <w:bidi/>
+        <w:rPr>
+          <w:sz w:val="28"/>
+          <w:szCs w:val="28"/>
+          <w:rtl/>
+        </w:rPr>
+      </w:pPr>
+      <w:r>
+        <w:rPr>
+          <w:sz w:val="28"/>
+          <w:szCs w:val="28"/>
+          <w:rtl/>
+        </w:rPr>
+        <w:t>דומיין קינאז תוך־תאי</w:t>
+      </w:r>
     </w:p>
     <w:p>
       <w:pPr>
@@ -3498,43 +3208,7 @@
           <w:szCs w:val="28"/>
           <w:rtl/>
         </w:rPr>
-        <w:t xml:space="preserve">מוטציות סרטניות רבות מתרחשות </w:t>
-      </w:r>
-      <w:proofErr w:type="spellStart"/>
-      <w:r>
-        <w:rPr>
-          <w:sz w:val="28"/>
-          <w:szCs w:val="28"/>
-          <w:rtl/>
-        </w:rPr>
-        <w:t>בדומיין</w:t>
-      </w:r>
-      <w:proofErr w:type="spellEnd"/>
-      <w:r>
-        <w:rPr>
-          <w:sz w:val="28"/>
-          <w:szCs w:val="28"/>
-          <w:rtl/>
-        </w:rPr>
-        <w:t xml:space="preserve"> </w:t>
-      </w:r>
-      <w:proofErr w:type="spellStart"/>
-      <w:r>
-        <w:rPr>
-          <w:sz w:val="28"/>
-          <w:szCs w:val="28"/>
-          <w:rtl/>
-        </w:rPr>
-        <w:t>הקינאז</w:t>
-      </w:r>
-      <w:proofErr w:type="spellEnd"/>
-      <w:r>
-        <w:rPr>
-          <w:sz w:val="28"/>
-          <w:szCs w:val="28"/>
-          <w:rtl/>
-        </w:rPr>
-        <w:t xml:space="preserve"> וגורמות להפעלה קבועה של אותות גדילה.</w:t>
+        <w:t>מוטציות סרטניות רבות מתרחשות בדומיין הקינאז וגורמות להפעלה קבועה של אותות גדילה.</w:t>
       </w:r>
     </w:p>
     <w:p>
@@ -3665,23 +3339,6 @@
     </w:p>
     <w:p>
       <w:pPr>
-        <w:bidi/>
-        <w:rPr>
-          <w:rFonts w:asciiTheme="minorBidi" w:hAnsiTheme="minorBidi" w:cstheme="minorBidi"/>
-        </w:rPr>
-      </w:pPr>
-    </w:p>
-    <w:p>
-      <w:pPr>
-        <w:pStyle w:val="Heading1"/>
-        <w:bidi/>
-        <w:rPr>
-          <w:rFonts w:asciiTheme="minorBidi" w:hAnsiTheme="minorBidi" w:cstheme="minorBidi"/>
-        </w:rPr>
-      </w:pPr>
-    </w:p>
-    <w:p>
-      <w:pPr>
         <w:pStyle w:val="Heading2"/>
         <w:bidi/>
         <w:rPr>
@@ -3702,19 +3359,9 @@
         </w:rPr>
         <w:t>. הגדרת המבנה (</w:t>
       </w:r>
-      <w:proofErr w:type="spellStart"/>
-      <w:r>
-        <w:t>Data</w:t>
-      </w:r>
-      <w:proofErr w:type="spellEnd"/>
-      <w:r>
-        <w:t xml:space="preserve"> </w:t>
-      </w:r>
-      <w:proofErr w:type="spellStart"/>
-      <w:r>
-        <w:t>Structures</w:t>
-      </w:r>
-      <w:proofErr w:type="spellEnd"/>
+      <w:r>
+        <w:t>Data Structures</w:t>
+      </w:r>
       <w:r>
         <w:rPr>
           <w:rtl/>
@@ -3742,7 +3389,6 @@
         </w:rPr>
         <w:t xml:space="preserve">לפני הפונקציות, הגדרת שני מילונים: </w:t>
       </w:r>
-      <w:proofErr w:type="spellStart"/>
       <w:r>
         <w:rPr>
           <w:sz w:val="28"/>
@@ -3751,7 +3397,6 @@
         </w:rPr>
         <w:t>EGFR_domains</w:t>
       </w:r>
-      <w:proofErr w:type="spellEnd"/>
       <w:r>
         <w:rPr>
           <w:rFonts w:hint="cs"/>
@@ -3762,7 +3407,6 @@
         </w:rPr>
         <w:t xml:space="preserve"> ו-</w:t>
       </w:r>
-      <w:proofErr w:type="spellStart"/>
       <w:r>
         <w:rPr>
           <w:sz w:val="28"/>
@@ -3771,7 +3415,6 @@
         </w:rPr>
         <w:t>KRAS_domains</w:t>
       </w:r>
-      <w:proofErr w:type="spellEnd"/>
       <w:r>
         <w:rPr>
           <w:rFonts w:hint="cs"/>
@@ -3798,13 +3441,12 @@
           <w:szCs w:val="28"/>
           <w:rtl/>
         </w:rPr>
-        <w:lastRenderedPageBreak/>
         <w:t>המטרה: מילונים שמייצגים טווחים של חומצות אמינו. המפתח הוא הטווח (התחלה וסוף) והערך הוא מונה שמתחיל ב-0.</w:t>
       </w:r>
     </w:p>
     <w:p>
       <w:pPr>
-        <w:pStyle w:val="Heading1"/>
+        <w:pStyle w:val="Heading2"/>
         <w:bidi/>
       </w:pPr>
       <w:bookmarkStart w:id="17" w:name="_ne5ou9fdmxey" w:colFirst="0" w:colLast="0"/>
@@ -3847,7 +3489,6 @@
         </w:rPr>
         <w:t xml:space="preserve">פונקציית חילוץ המוטציות: </w:t>
       </w:r>
-      <w:proofErr w:type="spellStart"/>
       <w:r>
         <w:rPr>
           <w:b/>
@@ -3857,7 +3498,6 @@
         </w:rPr>
         <w:t>get_list_of_all_protein_changes</w:t>
       </w:r>
-      <w:proofErr w:type="spellEnd"/>
     </w:p>
     <w:p>
       <w:pPr>
@@ -3922,6 +3562,7 @@
           <w:szCs w:val="28"/>
           <w:rtl/>
         </w:rPr>
+        <w:lastRenderedPageBreak/>
         <w:t xml:space="preserve">התוצאה: רשימה נקייה של שמות מוטציות (למשל: </w:t>
       </w:r>
       <w:r>
@@ -3971,7 +3612,6 @@
         </w:rPr>
         <w:t xml:space="preserve">פונקציית המרת טקסט למספרים: </w:t>
       </w:r>
-      <w:proofErr w:type="spellStart"/>
       <w:r>
         <w:rPr>
           <w:rFonts w:eastAsia="Roboto Mono"/>
@@ -3982,7 +3622,6 @@
         </w:rPr>
         <w:t>get_mutation_indices</w:t>
       </w:r>
-      <w:proofErr w:type="spellEnd"/>
     </w:p>
     <w:p>
       <w:pPr>
@@ -4000,7 +3639,6 @@
         </w:rPr>
         <w:t>מה היא עושה: משתמשת ב"ביטויים רגולריים" (</w:t>
       </w:r>
-      <w:proofErr w:type="spellStart"/>
       <w:r>
         <w:rPr>
           <w:rFonts w:eastAsia="Roboto Mono"/>
@@ -4009,7 +3647,6 @@
         </w:rPr>
         <w:t>re</w:t>
       </w:r>
-      <w:proofErr w:type="spellEnd"/>
       <w:r>
         <w:rPr>
           <w:sz w:val="28"/>
@@ -4150,7 +3787,6 @@
         </w:rPr>
         <w:t xml:space="preserve">פונקציית הספירה והשיוך: </w:t>
       </w:r>
-      <w:proofErr w:type="spellStart"/>
       <w:r>
         <w:rPr>
           <w:rFonts w:eastAsia="Roboto Mono"/>
@@ -4161,7 +3797,6 @@
         </w:rPr>
         <w:t>update_domain_counts</w:t>
       </w:r>
-      <w:proofErr w:type="spellEnd"/>
     </w:p>
     <w:p>
       <w:pPr>
@@ -4287,29 +3922,7 @@
           <w:szCs w:val="28"/>
           <w:rtl/>
         </w:rPr>
-        <w:t xml:space="preserve">חיבור של </w:t>
-      </w:r>
-      <w:proofErr w:type="spellStart"/>
-      <w:r>
-        <w:rPr>
-          <w:b/>
-          <w:bCs/>
-          <w:sz w:val="28"/>
-          <w:szCs w:val="28"/>
-          <w:rtl/>
-        </w:rPr>
-        <w:t>הכל</w:t>
-      </w:r>
-      <w:proofErr w:type="spellEnd"/>
-      <w:r>
-        <w:rPr>
-          <w:b/>
-          <w:bCs/>
-          <w:sz w:val="28"/>
-          <w:szCs w:val="28"/>
-          <w:rtl/>
-        </w:rPr>
-        <w:t xml:space="preserve"> ביחד</w:t>
+        <w:t>חיבור של הכל ביחד</w:t>
       </w:r>
     </w:p>
     <w:p>
@@ -4476,7 +4089,6 @@
           <w:szCs w:val="28"/>
         </w:rPr>
       </w:pPr>
-      <w:proofErr w:type="spellStart"/>
       <w:r>
         <w:rPr>
           <w:sz w:val="28"/>
@@ -4484,7 +4096,6 @@
         </w:rPr>
         <w:t>UniProt</w:t>
       </w:r>
-      <w:proofErr w:type="spellEnd"/>
       <w:r>
         <w:rPr>
           <w:sz w:val="28"/>
@@ -4501,7 +4112,6 @@
         </w:rPr>
         <w:br/>
       </w:r>
-      <w:proofErr w:type="spellStart"/>
       <w:r>
         <w:rPr>
           <w:sz w:val="28"/>
@@ -4509,7 +4119,6 @@
         </w:rPr>
         <w:t>cbioportal</w:t>
       </w:r>
-      <w:proofErr w:type="spellEnd"/>
       <w:r>
         <w:rPr>
           <w:sz w:val="28"/>
@@ -4540,20 +4149,354 @@
           <w:sz w:val="36"/>
           <w:szCs w:val="36"/>
           <w:shd w:val="clear" w:color="auto" w:fill="F8F9FA"/>
+          <w:rtl/>
         </w:rPr>
       </w:pPr>
       <w:bookmarkStart w:id="34" w:name="_Toc227282093"/>
       <w:r>
+        <w:rPr>
+          <w:rFonts w:asciiTheme="minorBidi" w:eastAsia="Alef" w:hAnsiTheme="minorBidi" w:cstheme="minorBidi" w:hint="cs"/>
+          <w:sz w:val="36"/>
+          <w:szCs w:val="36"/>
+          <w:shd w:val="clear" w:color="auto" w:fill="F8F9FA"/>
+          <w:rtl/>
+        </w:rPr>
+        <w:lastRenderedPageBreak/>
+        <w:t xml:space="preserve">ניתוח התוצאות </w:t>
+      </w:r>
+    </w:p>
+    <w:p>
+      <w:pPr>
+        <w:bidi/>
+        <w:rPr>
+          <w:sz w:val="28"/>
+          <w:szCs w:val="28"/>
+          <w:rtl/>
+          <w:lang w:val="en-US"/>
+        </w:rPr>
+      </w:pPr>
+      <w:r>
+        <w:rPr>
+          <w:rFonts w:hint="cs"/>
+          <w:sz w:val="28"/>
+          <w:szCs w:val="28"/>
+          <w:rtl/>
+        </w:rPr>
+        <w:t>לאחר שיהיה לנו את רשימ</w:t>
+      </w:r>
+      <w:r>
+        <w:rPr>
+          <w:rFonts w:hint="cs"/>
+          <w:sz w:val="28"/>
+          <w:szCs w:val="28"/>
+          <w:rtl/>
+          <w:lang w:val="en-US"/>
+        </w:rPr>
+        <w:t xml:space="preserve">ת כמות המוטציות בכל דומיין, אנחנו נצטרך לבדוק לאיזה דומיינים יש </w:t>
+      </w:r>
+      <w:r>
+        <w:rPr>
+          <w:rFonts w:hint="cs"/>
+          <w:sz w:val="28"/>
+          <w:szCs w:val="28"/>
+          <w:rtl/>
+          <w:lang w:val="en-US"/>
+        </w:rPr>
+        <w:t>כמות מוטציות חריגה</w:t>
+      </w:r>
+      <w:r>
+        <w:rPr>
+          <w:rFonts w:hint="cs"/>
+          <w:sz w:val="28"/>
+          <w:szCs w:val="28"/>
+          <w:rtl/>
+          <w:lang w:val="en-US"/>
+        </w:rPr>
+        <w:t xml:space="preserve">. </w:t>
+      </w:r>
+      <w:r>
+        <w:rPr>
+          <w:sz w:val="28"/>
+          <w:szCs w:val="28"/>
+          <w:rtl/>
+          <w:lang w:val="en-US"/>
+        </w:rPr>
+        <w:t xml:space="preserve">הניתוח חייב לקחת בחשבון את אורך הדומיין, שכן דומיין ארוך יותר עשוי להכיל יותר מוטציות </w:t>
+      </w:r>
+      <w:r>
+        <w:rPr>
+          <w:rFonts w:hint="cs"/>
+          <w:sz w:val="28"/>
+          <w:szCs w:val="28"/>
+          <w:rtl/>
+          <w:lang w:val="en-US"/>
+        </w:rPr>
+        <w:t xml:space="preserve">באופן </w:t>
+      </w:r>
+      <w:r>
+        <w:rPr>
+          <w:rFonts w:hint="cs"/>
+          <w:sz w:val="28"/>
+          <w:szCs w:val="28"/>
+          <w:rtl/>
+          <w:lang w:val="en-US"/>
+        </w:rPr>
+        <w:t>אקראי</w:t>
+      </w:r>
+      <w:r>
+        <w:rPr>
+          <w:sz w:val="28"/>
+          <w:szCs w:val="28"/>
+          <w:rtl/>
+          <w:lang w:val="en-US"/>
+        </w:rPr>
+        <w:t>.</w:t>
+      </w:r>
+      <w:r>
+        <w:rPr>
+          <w:sz w:val="28"/>
+          <w:szCs w:val="28"/>
+          <w:rtl/>
+          <w:lang w:val="en-US"/>
+        </w:rPr>
+        <w:br/>
+      </w:r>
+      <w:r>
+        <w:rPr>
+          <w:rFonts w:hint="cs"/>
+          <w:sz w:val="28"/>
+          <w:szCs w:val="28"/>
+          <w:rtl/>
+          <w:lang w:val="en-US"/>
+        </w:rPr>
+        <w:t>לשם כך</w:t>
+      </w:r>
+      <w:r>
+        <w:rPr>
+          <w:rFonts w:hint="cs"/>
+          <w:sz w:val="28"/>
+          <w:szCs w:val="28"/>
+          <w:rtl/>
+          <w:lang w:val="en-US"/>
+        </w:rPr>
+        <w:t xml:space="preserve"> נשתמש ב</w:t>
+      </w:r>
+      <w:r>
+        <w:rPr>
+          <w:rFonts w:hint="cs"/>
+          <w:sz w:val="28"/>
+          <w:szCs w:val="28"/>
+          <w:rtl/>
+          <w:lang w:val="en-US"/>
+        </w:rPr>
+        <w:t>רגרסיה לוגיסטית.</w:t>
+      </w:r>
+      <w:r>
+        <w:rPr>
+          <w:sz w:val="28"/>
+          <w:szCs w:val="28"/>
+          <w:rtl/>
+          <w:lang w:val="en-US"/>
+        </w:rPr>
+        <w:br/>
+      </w:r>
+    </w:p>
+    <w:p>
+      <w:pPr>
+        <w:bidi/>
+        <w:rPr>
+          <w:sz w:val="28"/>
+          <w:szCs w:val="28"/>
+          <w:rtl/>
+          <w:lang w:val="en-US"/>
+        </w:rPr>
+      </w:pPr>
+      <w:r>
+        <w:rPr>
+          <w:sz w:val="28"/>
+          <w:szCs w:val="28"/>
+          <w:rtl/>
+          <w:lang w:val="en-US"/>
+        </w:rPr>
+        <w:t>רגרסיה לוגיסטית היא מודל סטטיסטי המשמש לחיזוי ההסתברות של משתנה בינארי (משתנה שיכול לקבל אחת משתי תוצאות: 0 או 1). בפרויקט שלנו:</w:t>
+      </w:r>
+      <w:r>
+        <w:rPr>
+          <w:rFonts w:hint="cs"/>
+          <w:sz w:val="28"/>
+          <w:szCs w:val="28"/>
+          <w:rtl/>
+          <w:lang w:val="en-US"/>
+        </w:rPr>
+        <w:t xml:space="preserve"> </w:t>
+      </w:r>
+      <w:r>
+        <w:rPr>
+          <w:sz w:val="28"/>
+          <w:szCs w:val="28"/>
+          <w:rtl/>
+          <w:lang w:val="en-US"/>
+        </w:rPr>
+        <w:br/>
+      </w:r>
+      <w:r>
+        <w:rPr>
+          <w:sz w:val="28"/>
+          <w:szCs w:val="28"/>
+          <w:rtl/>
+          <w:lang w:val="en-US"/>
+        </w:rPr>
+        <w:t>המשתנה התלוי (</w:t>
+      </w:r>
+      <w:r>
+        <w:rPr>
+          <w:sz w:val="28"/>
+          <w:szCs w:val="28"/>
+          <w:lang w:val="en-US"/>
+        </w:rPr>
+        <w:t>Y</w:t>
+      </w:r>
+      <w:r>
+        <w:rPr>
+          <w:sz w:val="28"/>
+          <w:szCs w:val="28"/>
+          <w:rtl/>
+          <w:lang w:val="en-US"/>
+        </w:rPr>
+        <w:t>): האם עמדה מסוימת בחלבון עברה מוטציה? (1 = כן, 0 = לא).</w:t>
+      </w:r>
+      <w:r>
+        <w:rPr>
+          <w:rFonts w:hint="cs"/>
+          <w:sz w:val="28"/>
+          <w:szCs w:val="28"/>
+          <w:rtl/>
+          <w:lang w:val="en-US"/>
+        </w:rPr>
+        <w:t xml:space="preserve"> </w:t>
+      </w:r>
+      <w:r>
+        <w:rPr>
+          <w:sz w:val="28"/>
+          <w:szCs w:val="28"/>
+          <w:rtl/>
+          <w:lang w:val="en-US"/>
+        </w:rPr>
+        <w:t>המשתנה הבלתי תלוי (</w:t>
+      </w:r>
+      <w:r>
+        <w:rPr>
+          <w:sz w:val="28"/>
+          <w:szCs w:val="28"/>
+          <w:lang w:val="en-US"/>
+        </w:rPr>
+        <w:t>X</w:t>
+      </w:r>
+      <w:r>
+        <w:rPr>
+          <w:sz w:val="28"/>
+          <w:szCs w:val="28"/>
+          <w:rtl/>
+          <w:lang w:val="en-US"/>
+        </w:rPr>
+        <w:t>): האם העמדה נמצאת בתוך דומיין פונקציונלי מסוים? (1 = כן, 0 = לא).</w:t>
+      </w:r>
+      <w:r>
+        <w:rPr>
+          <w:rFonts w:hint="cs"/>
+          <w:sz w:val="28"/>
+          <w:szCs w:val="28"/>
+          <w:rtl/>
+          <w:lang w:val="en-US"/>
+        </w:rPr>
+        <w:t xml:space="preserve"> </w:t>
+      </w:r>
+    </w:p>
+    <w:p>
+      <w:pPr>
+        <w:bidi/>
+        <w:rPr>
+          <w:rFonts w:hint="cs"/>
+          <w:sz w:val="28"/>
+          <w:szCs w:val="28"/>
+          <w:rtl/>
+          <w:lang w:val="en-US"/>
+        </w:rPr>
+      </w:pPr>
+      <w:r>
+        <w:rPr>
+          <w:sz w:val="28"/>
+          <w:szCs w:val="28"/>
+          <w:rtl/>
+          <w:lang w:val="en-US"/>
+        </w:rPr>
+        <w:t>באמצעות המודל, נוכל לחשב את ה-</w:t>
+      </w:r>
+      <w:r>
+        <w:rPr>
+          <w:sz w:val="28"/>
+          <w:szCs w:val="28"/>
+          <w:lang w:val="en-US"/>
+        </w:rPr>
+        <w:t>Odds Ratio</w:t>
+      </w:r>
+      <w:r>
+        <w:rPr>
+          <w:sz w:val="28"/>
+          <w:szCs w:val="28"/>
+          <w:rtl/>
+          <w:lang w:val="en-US"/>
+        </w:rPr>
+        <w:t xml:space="preserve"> (יחס הסיכויים). מדד זה יגיד לנו פי כמה גדול הסיכוי למצוא מוטציה בתוך דומיין מסוים לעומת שאר החלבון. אם יחס הסיכויים גדול מ-1 באופן מובהק, נוכל להסיק שהדומיין הוא אכן </w:t>
+      </w:r>
+      <w:r>
+        <w:rPr>
+          <w:sz w:val="28"/>
+          <w:szCs w:val="28"/>
+          <w:lang w:val="en-US"/>
+        </w:rPr>
+        <w:t>Hotspot</w:t>
+      </w:r>
+      <w:r>
+        <w:rPr>
+          <w:sz w:val="28"/>
+          <w:szCs w:val="28"/>
+          <w:rtl/>
+          <w:lang w:val="en-US"/>
+        </w:rPr>
+        <w:t xml:space="preserve"> שנבחר על ידי הברירה הטבעית של הגידול, ולא רק </w:t>
+      </w:r>
+      <w:r>
+        <w:rPr>
+          <w:rFonts w:hint="cs"/>
+          <w:sz w:val="28"/>
+          <w:szCs w:val="28"/>
+          <w:rtl/>
+          <w:lang w:val="en-US"/>
+        </w:rPr>
+        <w:t>דומיין עם הרבה מוטציות עקב אורכו.</w:t>
+      </w:r>
+      <w:r>
+        <w:rPr>
+          <w:sz w:val="28"/>
+          <w:szCs w:val="28"/>
+          <w:rtl/>
+          <w:lang w:val="en-US"/>
+        </w:rPr>
+        <w:br/>
+      </w:r>
+    </w:p>
+    <w:p>
+      <w:pPr>
+        <w:pStyle w:val="Heading1"/>
+        <w:bidi/>
         <w:rPr>
           <w:rFonts w:asciiTheme="minorBidi" w:eastAsia="Alef" w:hAnsiTheme="minorBidi" w:cstheme="minorBidi"/>
           <w:sz w:val="36"/>
           <w:szCs w:val="36"/>
           <w:shd w:val="clear" w:color="auto" w:fill="F8F9FA"/>
-          <w:rtl/>
-        </w:rPr>
-        <w:t xml:space="preserve">תכנון אופן </w:t>
-      </w:r>
-      <w:proofErr w:type="spellStart"/>
+        </w:rPr>
+      </w:pPr>
       <w:r>
         <w:rPr>
           <w:rFonts w:asciiTheme="minorBidi" w:eastAsia="Alef" w:hAnsiTheme="minorBidi" w:cstheme="minorBidi"/>
@@ -4562,18 +4505,7 @@
           <w:shd w:val="clear" w:color="auto" w:fill="F8F9FA"/>
           <w:rtl/>
         </w:rPr>
-        <w:t>הולידציה</w:t>
-      </w:r>
-      <w:proofErr w:type="spellEnd"/>
-      <w:r>
-        <w:rPr>
-          <w:rFonts w:asciiTheme="minorBidi" w:eastAsia="Alef" w:hAnsiTheme="minorBidi" w:cstheme="minorBidi"/>
-          <w:sz w:val="36"/>
-          <w:szCs w:val="36"/>
-          <w:shd w:val="clear" w:color="auto" w:fill="F8F9FA"/>
-          <w:rtl/>
-        </w:rPr>
-        <w:t xml:space="preserve"> של הקוד והתוצאות</w:t>
+        <w:t>תכנון אופן הולידציה של הקוד והתוצאות</w:t>
       </w:r>
       <w:bookmarkEnd w:id="34"/>
     </w:p>
@@ -4644,7 +4576,6 @@
         </w:rPr>
         <w:t xml:space="preserve">בדיקה של ה </w:t>
       </w:r>
-      <w:proofErr w:type="spellStart"/>
       <w:r>
         <w:rPr>
           <w:sz w:val="28"/>
@@ -4653,7 +4584,6 @@
         </w:rPr>
         <w:t>hotspots</w:t>
       </w:r>
-      <w:proofErr w:type="spellEnd"/>
       <w:r>
         <w:rPr>
           <w:sz w:val="28"/>
@@ -4703,7 +4633,6 @@
       <w:pPr>
         <w:bidi/>
         <w:rPr>
-          <w:rFonts w:hint="cs"/>
           <w:sz w:val="28"/>
           <w:szCs w:val="28"/>
           <w:rtl/>
@@ -4747,23 +4676,13 @@
         </w:rPr>
         <w:t>c</w:t>
       </w:r>
-      <w:proofErr w:type="spellStart"/>
-      <w:r>
-        <w:rPr>
-          <w:sz w:val="28"/>
-          <w:szCs w:val="28"/>
-          <w:lang w:val="en-US"/>
-        </w:rPr>
-        <w:t>bioportal</w:t>
-      </w:r>
-      <w:proofErr w:type="spellEnd"/>
-      <w:r>
-        <w:rPr>
-          <w:sz w:val="28"/>
-          <w:szCs w:val="28"/>
-          <w:lang w:val="en-US"/>
-        </w:rPr>
-        <w:t>-</w:t>
+      <w:r>
+        <w:rPr>
+          <w:sz w:val="28"/>
+          <w:szCs w:val="28"/>
+          <w:lang w:val="en-US"/>
+        </w:rPr>
+        <w:t>bioportal-</w:t>
       </w:r>
       <w:hyperlink r:id="rId8" w:history="1">
         <w:r>
@@ -4781,43 +4700,77 @@
       <w:pPr>
         <w:bidi/>
         <w:rPr>
+          <w:sz w:val="28"/>
+          <w:szCs w:val="28"/>
+          <w:rtl/>
+          <w:lang w:val="en-US"/>
+        </w:rPr>
+      </w:pPr>
+      <w:r>
+        <w:rPr>
+          <w:sz w:val="28"/>
+          <w:szCs w:val="28"/>
+          <w:lang w:val="en-US"/>
+        </w:rPr>
+        <w:t>NIH</w:t>
+      </w:r>
+      <w:r>
+        <w:rPr>
           <w:rFonts w:hint="cs"/>
           <w:sz w:val="28"/>
           <w:szCs w:val="28"/>
           <w:rtl/>
           <w:lang w:val="en-US"/>
         </w:rPr>
-      </w:pPr>
-      <w:proofErr w:type="gramStart"/>
-      <w:r>
-        <w:rPr>
-          <w:sz w:val="28"/>
-          <w:szCs w:val="28"/>
-          <w:lang w:val="en-US"/>
-        </w:rPr>
-        <w:t>NIH</w:t>
-      </w:r>
-      <w:r>
-        <w:rPr>
-          <w:rFonts w:hint="cs"/>
-          <w:sz w:val="28"/>
-          <w:szCs w:val="28"/>
-          <w:rtl/>
-          <w:lang w:val="en-US"/>
-        </w:rPr>
-        <w:t>(</w:t>
-      </w:r>
-      <w:proofErr w:type="gramEnd"/>
-      <w:r>
-        <w:rPr>
-          <w:rFonts w:hint="cs"/>
-          <w:sz w:val="28"/>
-          <w:szCs w:val="28"/>
-          <w:rtl/>
-          <w:lang w:val="en-US"/>
-        </w:rPr>
-        <w:t>עדיין לא השתמשנו)</w:t>
-      </w:r>
+        <w:t>(עדיין לא השתמשנו)</w:t>
+      </w:r>
+    </w:p>
+    <w:p>
+      <w:pPr>
+        <w:bidi/>
+        <w:rPr>
+          <w:rFonts w:asciiTheme="minorBidi" w:eastAsia="Alef" w:hAnsiTheme="minorBidi" w:cstheme="minorBidi"/>
+          <w:sz w:val="28"/>
+          <w:szCs w:val="28"/>
+          <w:shd w:val="clear" w:color="auto" w:fill="F8F9FA"/>
+          <w:lang w:val="en-US"/>
+        </w:rPr>
+      </w:pPr>
+      <w:r>
+        <w:rPr>
+          <w:rFonts w:asciiTheme="minorBidi" w:eastAsia="Alef" w:hAnsiTheme="minorBidi" w:cstheme="minorBidi"/>
+          <w:sz w:val="28"/>
+          <w:szCs w:val="28"/>
+          <w:shd w:val="clear" w:color="auto" w:fill="F8F9FA"/>
+          <w:lang w:val="en-US"/>
+        </w:rPr>
+        <w:t xml:space="preserve">Logistic regression - </w:t>
+      </w:r>
+      <w:hyperlink r:id="rId9" w:history="1">
+        <w:r>
+          <w:rPr>
+            <w:rStyle w:val="Hyperlink"/>
+            <w:rFonts w:asciiTheme="minorBidi" w:eastAsia="Alef" w:hAnsiTheme="minorBidi" w:cstheme="minorBidi"/>
+            <w:sz w:val="28"/>
+            <w:szCs w:val="28"/>
+            <w:shd w:val="clear" w:color="auto" w:fill="F8F9FA"/>
+            <w:lang w:val="en-US"/>
+          </w:rPr>
+          <w:t>https://youtu.be/yIYKR4sgzI8?si=934UdgRSUNDIXlyC</w:t>
+        </w:r>
+      </w:hyperlink>
+    </w:p>
+    <w:p>
+      <w:pPr>
+        <w:bidi/>
+        <w:rPr>
+          <w:rFonts w:asciiTheme="minorBidi" w:eastAsia="Alef" w:hAnsiTheme="minorBidi" w:cstheme="minorBidi" w:hint="cs"/>
+          <w:sz w:val="36"/>
+          <w:szCs w:val="36"/>
+          <w:shd w:val="clear" w:color="auto" w:fill="F8F9FA"/>
+          <w:lang w:val="en-US"/>
+        </w:rPr>
+      </w:pPr>
     </w:p>
     <w:p>
       <w:pPr>
@@ -4827,6 +4780,7 @@
           <w:sz w:val="36"/>
           <w:szCs w:val="36"/>
           <w:shd w:val="clear" w:color="auto" w:fill="F8F9FA"/>
+          <w:lang w:val="en-US"/>
         </w:rPr>
       </w:pPr>
     </w:p>
@@ -4838,6 +4792,7 @@
           <w:sz w:val="36"/>
           <w:szCs w:val="36"/>
           <w:shd w:val="clear" w:color="auto" w:fill="F8F9FA"/>
+          <w:lang w:val="en-US"/>
         </w:rPr>
       </w:pPr>
     </w:p>
@@ -4849,6 +4804,7 @@
           <w:sz w:val="36"/>
           <w:szCs w:val="36"/>
           <w:shd w:val="clear" w:color="auto" w:fill="F8F9FA"/>
+          <w:lang w:val="en-US"/>
         </w:rPr>
       </w:pPr>
     </w:p>
@@ -4860,6 +4816,7 @@
           <w:sz w:val="36"/>
           <w:szCs w:val="36"/>
           <w:shd w:val="clear" w:color="auto" w:fill="F8F9FA"/>
+          <w:lang w:val="en-US"/>
         </w:rPr>
       </w:pPr>
     </w:p>
@@ -4871,6 +4828,7 @@
           <w:sz w:val="36"/>
           <w:szCs w:val="36"/>
           <w:shd w:val="clear" w:color="auto" w:fill="F8F9FA"/>
+          <w:lang w:val="en-US"/>
         </w:rPr>
       </w:pPr>
     </w:p>
@@ -4882,6 +4840,7 @@
           <w:sz w:val="36"/>
           <w:szCs w:val="36"/>
           <w:shd w:val="clear" w:color="auto" w:fill="F8F9FA"/>
+          <w:lang w:val="en-US"/>
         </w:rPr>
       </w:pPr>
     </w:p>
@@ -4893,6 +4852,7 @@
           <w:sz w:val="36"/>
           <w:szCs w:val="36"/>
           <w:shd w:val="clear" w:color="auto" w:fill="F8F9FA"/>
+          <w:lang w:val="en-US"/>
         </w:rPr>
       </w:pPr>
     </w:p>
@@ -4904,6 +4864,7 @@
           <w:sz w:val="36"/>
           <w:szCs w:val="36"/>
           <w:shd w:val="clear" w:color="auto" w:fill="F8F9FA"/>
+          <w:lang w:val="en-US"/>
         </w:rPr>
       </w:pPr>
     </w:p>
@@ -4915,6 +4876,7 @@
           <w:sz w:val="36"/>
           <w:szCs w:val="36"/>
           <w:shd w:val="clear" w:color="auto" w:fill="F8F9FA"/>
+          <w:lang w:val="en-US"/>
         </w:rPr>
       </w:pPr>
     </w:p>
@@ -4926,6 +4888,7 @@
           <w:sz w:val="36"/>
           <w:szCs w:val="36"/>
           <w:shd w:val="clear" w:color="auto" w:fill="F8F9FA"/>
+          <w:lang w:val="en-US"/>
         </w:rPr>
       </w:pPr>
     </w:p>
@@ -4937,6 +4900,7 @@
           <w:sz w:val="36"/>
           <w:szCs w:val="36"/>
           <w:shd w:val="clear" w:color="auto" w:fill="F8F9FA"/>
+          <w:lang w:val="en-US"/>
         </w:rPr>
       </w:pPr>
     </w:p>
@@ -4948,6 +4912,7 @@
           <w:sz w:val="36"/>
           <w:szCs w:val="36"/>
           <w:shd w:val="clear" w:color="auto" w:fill="F8F9FA"/>
+          <w:lang w:val="en-US"/>
         </w:rPr>
       </w:pPr>
     </w:p>
@@ -4959,6 +4924,7 @@
           <w:sz w:val="36"/>
           <w:szCs w:val="36"/>
           <w:shd w:val="clear" w:color="auto" w:fill="F8F9FA"/>
+          <w:lang w:val="en-US"/>
         </w:rPr>
       </w:pPr>
     </w:p>
@@ -4970,28 +4936,19 @@
           <w:sz w:val="36"/>
           <w:szCs w:val="36"/>
           <w:shd w:val="clear" w:color="auto" w:fill="F8F9FA"/>
-        </w:rPr>
-      </w:pPr>
-    </w:p>
-    <w:p>
-      <w:pPr>
-        <w:bidi/>
-        <w:rPr>
-          <w:rFonts w:asciiTheme="minorBidi" w:eastAsia="Alef" w:hAnsiTheme="minorBidi" w:cstheme="minorBidi"/>
+          <w:lang w:val="en-US"/>
+        </w:rPr>
+      </w:pPr>
+    </w:p>
+    <w:p>
+      <w:pPr>
+        <w:bidi/>
+        <w:rPr>
+          <w:rFonts w:asciiTheme="minorBidi" w:hAnsiTheme="minorBidi" w:cstheme="minorBidi"/>
           <w:sz w:val="36"/>
           <w:szCs w:val="36"/>
           <w:shd w:val="clear" w:color="auto" w:fill="F8F9FA"/>
-        </w:rPr>
-      </w:pPr>
-    </w:p>
-    <w:p>
-      <w:pPr>
-        <w:bidi/>
-        <w:rPr>
-          <w:rFonts w:asciiTheme="minorBidi" w:hAnsiTheme="minorBidi" w:cstheme="minorBidi"/>
-          <w:sz w:val="36"/>
-          <w:szCs w:val="36"/>
-          <w:shd w:val="clear" w:color="auto" w:fill="F8F9FA"/>
+          <w:lang w:val="en-US"/>
         </w:rPr>
       </w:pPr>
     </w:p>
@@ -6893,6 +6850,7 @@
   <w:style w:type="character" w:default="1" w:styleId="DefaultParagraphFont">
     <w:name w:val="Default Paragraph Font"/>
     <w:uiPriority w:val="1"/>
+    <w:semiHidden/>
     <w:unhideWhenUsed/>
   </w:style>
   <w:style w:type="table" w:default="1" w:styleId="TableNormal">

</xml_diff>

<commit_message>
add: to document some elaborations on KRAS domains. modify: divide main.py to 2 more files. still needs to change some stuff but for now its fine
</commit_message>
<xml_diff>
--- a/documents/הצעת המחקר .docx
+++ b/documents/הצעת המחקר .docx
@@ -2140,7 +2140,7 @@
       <w:pPr>
         <w:bidi/>
         <w:rPr>
-          <w:rFonts w:asciiTheme="minorBidi" w:eastAsia="Alef" w:hAnsiTheme="minorBidi" w:cstheme="minorBidi" w:hint="cs"/>
+          <w:rFonts w:asciiTheme="minorBidi" w:eastAsia="Alef" w:hAnsiTheme="minorBidi" w:cstheme="minorBidi"/>
           <w:sz w:val="28"/>
           <w:szCs w:val="28"/>
           <w:shd w:val="clear" w:color="auto" w:fill="F8F9FA"/>
@@ -2261,6 +2261,7 @@
           <w:rFonts w:asciiTheme="minorBidi" w:hAnsiTheme="minorBidi" w:cstheme="minorBidi"/>
           <w:sz w:val="28"/>
           <w:szCs w:val="28"/>
+          <w:rtl/>
         </w:rPr>
       </w:pPr>
       <w:r>
@@ -2306,6 +2307,561 @@
         </w:rPr>
         <w:t>)? ואם כן למה?</w:t>
       </w:r>
+    </w:p>
+    <w:p>
+      <w:pPr>
+        <w:bidi/>
+        <w:rPr>
+          <w:rFonts w:asciiTheme="minorBidi" w:hAnsiTheme="minorBidi" w:cstheme="minorBidi"/>
+          <w:sz w:val="28"/>
+          <w:szCs w:val="28"/>
+          <w:rtl/>
+        </w:rPr>
+      </w:pPr>
+    </w:p>
+    <w:p>
+      <w:pPr>
+        <w:pStyle w:val="Heading1"/>
+        <w:bidi/>
+        <w:rPr>
+          <w:sz w:val="36"/>
+          <w:szCs w:val="36"/>
+          <w:rtl/>
+        </w:rPr>
+      </w:pPr>
+      <w:r>
+        <w:rPr>
+          <w:rFonts w:hint="cs"/>
+          <w:sz w:val="36"/>
+          <w:szCs w:val="36"/>
+          <w:rtl/>
+        </w:rPr>
+        <w:t>רשימת מושגים</w:t>
+      </w:r>
+    </w:p>
+    <w:p>
+      <w:pPr>
+        <w:bidi/>
+        <w:rPr>
+          <w:sz w:val="28"/>
+          <w:szCs w:val="28"/>
+          <w:rtl/>
+        </w:rPr>
+      </w:pPr>
+      <w:r>
+        <w:rPr>
+          <w:b/>
+          <w:bCs/>
+          <w:sz w:val="28"/>
+          <w:szCs w:val="28"/>
+          <w:rtl/>
+        </w:rPr>
+        <w:t>שארית (</w:t>
+      </w:r>
+      <w:proofErr w:type="spellStart"/>
+      <w:r>
+        <w:rPr>
+          <w:b/>
+          <w:bCs/>
+          <w:sz w:val="28"/>
+          <w:szCs w:val="28"/>
+        </w:rPr>
+        <w:t>Residue</w:t>
+      </w:r>
+      <w:proofErr w:type="spellEnd"/>
+      <w:r>
+        <w:rPr>
+          <w:b/>
+          <w:bCs/>
+          <w:sz w:val="28"/>
+          <w:szCs w:val="28"/>
+          <w:rtl/>
+        </w:rPr>
+        <w:t>)</w:t>
+      </w:r>
+      <w:r>
+        <w:rPr>
+          <w:sz w:val="28"/>
+          <w:szCs w:val="28"/>
+          <w:rtl/>
+        </w:rPr>
+        <w:t xml:space="preserve">: יחידת בניין של חלבון (חומצת אמינו) כפי שהיא מופיעה בתוך שרשרת </w:t>
+      </w:r>
+      <w:proofErr w:type="spellStart"/>
+      <w:r>
+        <w:rPr>
+          <w:sz w:val="28"/>
+          <w:szCs w:val="28"/>
+          <w:rtl/>
+        </w:rPr>
+        <w:t>פוליפפטידית</w:t>
+      </w:r>
+      <w:proofErr w:type="spellEnd"/>
+      <w:r>
+        <w:rPr>
+          <w:sz w:val="28"/>
+          <w:szCs w:val="28"/>
+          <w:rtl/>
+        </w:rPr>
+        <w:t>. המונח "שארית" משמש לציון מיקום ספציפי ברצף החלבון המקופל (למשל: "שארית 12").</w:t>
+      </w:r>
+    </w:p>
+    <w:p>
+      <w:pPr>
+        <w:bidi/>
+        <w:rPr>
+          <w:sz w:val="28"/>
+          <w:szCs w:val="28"/>
+          <w:rtl/>
+        </w:rPr>
+      </w:pPr>
+      <w:r>
+        <w:rPr>
+          <w:b/>
+          <w:bCs/>
+          <w:sz w:val="28"/>
+          <w:szCs w:val="28"/>
+          <w:rtl/>
+        </w:rPr>
+        <w:t>דומיין פונקציונלי</w:t>
+      </w:r>
+      <w:r>
+        <w:rPr>
+          <w:b/>
+          <w:bCs/>
+          <w:sz w:val="28"/>
+          <w:szCs w:val="28"/>
+        </w:rPr>
+        <w:t xml:space="preserve"> </w:t>
+      </w:r>
+      <w:r>
+        <w:rPr>
+          <w:sz w:val="28"/>
+          <w:szCs w:val="28"/>
+          <w:lang w:val="en-US"/>
+        </w:rPr>
+        <w:t>:</w:t>
+      </w:r>
+      <w:r>
+        <w:rPr>
+          <w:b/>
+          <w:bCs/>
+          <w:sz w:val="28"/>
+          <w:szCs w:val="28"/>
+        </w:rPr>
+        <w:t>(</w:t>
+      </w:r>
+      <w:proofErr w:type="spellStart"/>
+      <w:r>
+        <w:rPr>
+          <w:b/>
+          <w:bCs/>
+          <w:sz w:val="28"/>
+          <w:szCs w:val="28"/>
+        </w:rPr>
+        <w:t>Functional</w:t>
+      </w:r>
+      <w:proofErr w:type="spellEnd"/>
+      <w:r>
+        <w:rPr>
+          <w:b/>
+          <w:bCs/>
+          <w:sz w:val="28"/>
+          <w:szCs w:val="28"/>
+        </w:rPr>
+        <w:t xml:space="preserve"> </w:t>
+      </w:r>
+      <w:proofErr w:type="spellStart"/>
+      <w:r>
+        <w:rPr>
+          <w:b/>
+          <w:bCs/>
+          <w:sz w:val="28"/>
+          <w:szCs w:val="28"/>
+        </w:rPr>
+        <w:t>Domain</w:t>
+      </w:r>
+      <w:proofErr w:type="spellEnd"/>
+      <w:r>
+        <w:rPr>
+          <w:b/>
+          <w:bCs/>
+          <w:sz w:val="28"/>
+          <w:szCs w:val="28"/>
+        </w:rPr>
+        <w:t>)</w:t>
+      </w:r>
+      <w:r>
+        <w:rPr>
+          <w:sz w:val="28"/>
+          <w:szCs w:val="28"/>
+        </w:rPr>
+        <w:t xml:space="preserve"> </w:t>
+      </w:r>
+      <w:r>
+        <w:rPr>
+          <w:sz w:val="28"/>
+          <w:szCs w:val="28"/>
+          <w:rtl/>
+        </w:rPr>
+        <w:t xml:space="preserve">יחידה מבנית בתוך החלבון שיש לה תפקיד ספציפי (כמו קישור למולקולה אחרת או פעילות אנזימטית). חלבונים מורכבים לרוב מכמה </w:t>
+      </w:r>
+      <w:proofErr w:type="spellStart"/>
+      <w:r>
+        <w:rPr>
+          <w:sz w:val="28"/>
+          <w:szCs w:val="28"/>
+          <w:rtl/>
+        </w:rPr>
+        <w:t>דומיינים</w:t>
+      </w:r>
+      <w:proofErr w:type="spellEnd"/>
+      <w:r>
+        <w:rPr>
+          <w:sz w:val="28"/>
+          <w:szCs w:val="28"/>
+          <w:rtl/>
+        </w:rPr>
+        <w:t xml:space="preserve"> הפועלים יחד</w:t>
+      </w:r>
+      <w:r>
+        <w:rPr>
+          <w:sz w:val="28"/>
+          <w:szCs w:val="28"/>
+        </w:rPr>
+        <w:t>.</w:t>
+      </w:r>
+    </w:p>
+    <w:p>
+      <w:pPr>
+        <w:bidi/>
+        <w:rPr>
+          <w:sz w:val="28"/>
+          <w:szCs w:val="28"/>
+          <w:rtl/>
+          <w:lang w:bidi="he"/>
+        </w:rPr>
+      </w:pPr>
+      <w:r>
+        <w:rPr>
+          <w:b/>
+          <w:bCs/>
+          <w:sz w:val="28"/>
+          <w:szCs w:val="28"/>
+          <w:rtl/>
+        </w:rPr>
+        <w:t>מוטציה</w:t>
+      </w:r>
+      <w:r>
+        <w:rPr>
+          <w:b/>
+          <w:bCs/>
+          <w:sz w:val="28"/>
+          <w:szCs w:val="28"/>
+        </w:rPr>
+        <w:t xml:space="preserve"> </w:t>
+      </w:r>
+      <w:r>
+        <w:rPr>
+          <w:b/>
+          <w:bCs/>
+          <w:sz w:val="28"/>
+          <w:szCs w:val="28"/>
+          <w:lang w:val="en-US"/>
+        </w:rPr>
+        <w:t>:</w:t>
+      </w:r>
+      <w:r>
+        <w:rPr>
+          <w:b/>
+          <w:bCs/>
+          <w:sz w:val="28"/>
+          <w:szCs w:val="28"/>
+        </w:rPr>
+        <w:t>(</w:t>
+      </w:r>
+      <w:proofErr w:type="spellStart"/>
+      <w:r>
+        <w:rPr>
+          <w:b/>
+          <w:bCs/>
+          <w:sz w:val="28"/>
+          <w:szCs w:val="28"/>
+        </w:rPr>
+        <w:t>Mutation</w:t>
+      </w:r>
+      <w:proofErr w:type="spellEnd"/>
+      <w:r>
+        <w:rPr>
+          <w:b/>
+          <w:bCs/>
+          <w:sz w:val="28"/>
+          <w:szCs w:val="28"/>
+        </w:rPr>
+        <w:t>)</w:t>
+      </w:r>
+      <w:r>
+        <w:rPr>
+          <w:sz w:val="28"/>
+          <w:szCs w:val="28"/>
+        </w:rPr>
+        <w:t xml:space="preserve"> </w:t>
+      </w:r>
+      <w:r>
+        <w:rPr>
+          <w:sz w:val="28"/>
+          <w:szCs w:val="28"/>
+          <w:rtl/>
+        </w:rPr>
+        <w:t>שינוי ברצף ה</w:t>
+      </w:r>
+      <w:r>
+        <w:rPr>
+          <w:sz w:val="28"/>
+          <w:szCs w:val="28"/>
+        </w:rPr>
+        <w:t>-</w:t>
+      </w:r>
+      <w:r>
+        <w:rPr>
+          <w:sz w:val="28"/>
+          <w:szCs w:val="28"/>
+          <w:lang w:val="en-US"/>
+        </w:rPr>
+        <w:t xml:space="preserve"> </w:t>
+      </w:r>
+      <w:r>
+        <w:rPr>
+          <w:sz w:val="28"/>
+          <w:szCs w:val="28"/>
+        </w:rPr>
+        <w:t xml:space="preserve">DNA </w:t>
+      </w:r>
+      <w:r>
+        <w:rPr>
+          <w:rFonts w:hint="cs"/>
+          <w:sz w:val="28"/>
+          <w:szCs w:val="28"/>
+          <w:rtl/>
+        </w:rPr>
+        <w:t xml:space="preserve"> </w:t>
+      </w:r>
+      <w:r>
+        <w:rPr>
+          <w:sz w:val="28"/>
+          <w:szCs w:val="28"/>
+          <w:rtl/>
+        </w:rPr>
+        <w:t xml:space="preserve">המוביל לשינוי בחומצת האמינו בחלבון. </w:t>
+      </w:r>
+      <w:r>
+        <w:rPr>
+          <w:rFonts w:hint="cs"/>
+          <w:sz w:val="28"/>
+          <w:szCs w:val="28"/>
+          <w:rtl/>
+        </w:rPr>
+        <w:t>מוטציות עלולות להשפיע על תפקוד החלבון ועל איכות ביצועו.</w:t>
+      </w:r>
+    </w:p>
+    <w:p>
+      <w:pPr>
+        <w:bidi/>
+        <w:rPr>
+          <w:sz w:val="28"/>
+          <w:szCs w:val="28"/>
+          <w:rtl/>
+        </w:rPr>
+      </w:pPr>
+      <w:r>
+        <w:rPr>
+          <w:b/>
+          <w:bCs/>
+          <w:sz w:val="28"/>
+          <w:szCs w:val="28"/>
+          <w:rtl/>
+        </w:rPr>
+        <w:t>מוקד מוטציות</w:t>
+      </w:r>
+      <w:r>
+        <w:rPr>
+          <w:b/>
+          <w:bCs/>
+          <w:sz w:val="28"/>
+          <w:szCs w:val="28"/>
+          <w:lang w:bidi="he"/>
+        </w:rPr>
+        <w:t xml:space="preserve"> </w:t>
+      </w:r>
+      <w:r>
+        <w:rPr>
+          <w:b/>
+          <w:bCs/>
+          <w:sz w:val="28"/>
+          <w:szCs w:val="28"/>
+          <w:lang w:val="en-US" w:bidi="he"/>
+        </w:rPr>
+        <w:t>:</w:t>
+      </w:r>
+      <w:r>
+        <w:rPr>
+          <w:b/>
+          <w:bCs/>
+          <w:sz w:val="28"/>
+          <w:szCs w:val="28"/>
+          <w:lang w:bidi="he"/>
+        </w:rPr>
+        <w:t>(</w:t>
+      </w:r>
+      <w:proofErr w:type="spellStart"/>
+      <w:r>
+        <w:rPr>
+          <w:b/>
+          <w:bCs/>
+          <w:sz w:val="28"/>
+          <w:szCs w:val="28"/>
+          <w:lang w:bidi="he"/>
+        </w:rPr>
+        <w:t>Hotspot</w:t>
+      </w:r>
+      <w:proofErr w:type="spellEnd"/>
+      <w:r>
+        <w:rPr>
+          <w:b/>
+          <w:bCs/>
+          <w:sz w:val="28"/>
+          <w:szCs w:val="28"/>
+          <w:lang w:bidi="he"/>
+        </w:rPr>
+        <w:t>)</w:t>
+      </w:r>
+      <w:r>
+        <w:rPr>
+          <w:sz w:val="28"/>
+          <w:szCs w:val="28"/>
+          <w:lang w:bidi="he"/>
+        </w:rPr>
+        <w:t xml:space="preserve"> </w:t>
+      </w:r>
+      <w:r>
+        <w:rPr>
+          <w:sz w:val="28"/>
+          <w:szCs w:val="28"/>
+          <w:rtl/>
+        </w:rPr>
+        <w:t>אזור ספציפי או עמדה מסוימת בחלבון שבהם מצטברות מוטציות בשכיחות גבוהה משמעותית משאר החלבון, לרוב בגלל שהן מעניקות יתרון הישרדותי לתא הסרטני</w:t>
+      </w:r>
+      <w:r>
+        <w:rPr>
+          <w:sz w:val="28"/>
+          <w:szCs w:val="28"/>
+          <w:lang w:bidi="he"/>
+        </w:rPr>
+        <w:t>.</w:t>
+      </w:r>
+    </w:p>
+    <w:p>
+      <w:pPr>
+        <w:bidi/>
+        <w:rPr>
+          <w:sz w:val="28"/>
+          <w:szCs w:val="28"/>
+          <w:rtl/>
+          <w:lang w:bidi="he"/>
+        </w:rPr>
+      </w:pPr>
+      <w:proofErr w:type="spellStart"/>
+      <w:r>
+        <w:rPr>
+          <w:b/>
+          <w:bCs/>
+          <w:sz w:val="28"/>
+          <w:szCs w:val="28"/>
+          <w:rtl/>
+        </w:rPr>
+        <w:t>אונקוגן</w:t>
+      </w:r>
+      <w:proofErr w:type="spellEnd"/>
+      <w:r>
+        <w:rPr>
+          <w:b/>
+          <w:bCs/>
+          <w:sz w:val="28"/>
+          <w:szCs w:val="28"/>
+        </w:rPr>
+        <w:t xml:space="preserve"> </w:t>
+      </w:r>
+      <w:r>
+        <w:rPr>
+          <w:sz w:val="28"/>
+          <w:szCs w:val="28"/>
+          <w:lang w:val="en-US"/>
+        </w:rPr>
+        <w:t>:</w:t>
+      </w:r>
+      <w:r>
+        <w:rPr>
+          <w:b/>
+          <w:bCs/>
+          <w:sz w:val="28"/>
+          <w:szCs w:val="28"/>
+        </w:rPr>
+        <w:t>(</w:t>
+      </w:r>
+      <w:proofErr w:type="spellStart"/>
+      <w:r>
+        <w:rPr>
+          <w:b/>
+          <w:bCs/>
+          <w:sz w:val="28"/>
+          <w:szCs w:val="28"/>
+        </w:rPr>
+        <w:t>Oncogene</w:t>
+      </w:r>
+      <w:proofErr w:type="spellEnd"/>
+      <w:r>
+        <w:rPr>
+          <w:b/>
+          <w:bCs/>
+          <w:sz w:val="28"/>
+          <w:szCs w:val="28"/>
+        </w:rPr>
+        <w:t>)</w:t>
+      </w:r>
+      <w:r>
+        <w:rPr>
+          <w:sz w:val="28"/>
+          <w:szCs w:val="28"/>
+        </w:rPr>
+        <w:t xml:space="preserve"> </w:t>
+      </w:r>
+      <w:r>
+        <w:rPr>
+          <w:sz w:val="28"/>
+          <w:szCs w:val="28"/>
+          <w:rtl/>
+        </w:rPr>
+        <w:t>גן שבמצבו התקין מסייע לצמיחת התא, אך כתוצאה ממוטציה הופך ל"גן סרטני" הגורם לחלוקת תאים בלתי מבוקרת</w:t>
+      </w:r>
+      <w:r>
+        <w:rPr>
+          <w:sz w:val="28"/>
+          <w:szCs w:val="28"/>
+        </w:rPr>
+        <w:t>.</w:t>
+      </w:r>
+    </w:p>
+    <w:p>
+      <w:pPr>
+        <w:bidi/>
+        <w:rPr>
+          <w:rFonts w:hint="cs"/>
+          <w:sz w:val="28"/>
+          <w:szCs w:val="28"/>
+          <w:rtl/>
+          <w:lang w:bidi="he"/>
+        </w:rPr>
+      </w:pPr>
     </w:p>
     <w:p>
       <w:pPr>
@@ -2634,6 +3190,7 @@
           <w:rtl/>
           <w:lang w:val="en-US"/>
         </w:rPr>
+        <w:lastRenderedPageBreak/>
         <w:t xml:space="preserve">4. הסבר על התופעה: אם אכן יש יותר מוטציות </w:t>
       </w:r>
       <w:r>
@@ -2756,6 +3313,7 @@
         </w:rPr>
         <w:t xml:space="preserve"> מתפקדים כמתגים ביולוגיים שאחראים על העברת אותות לצמיחת התא. המוטציות נוטות להופיע בדומיינים שאחראים על כיבוי המתג או על הפעלתו (כמו דומיין ה-</w:t>
       </w:r>
+      <w:proofErr w:type="spellStart"/>
       <w:r>
         <w:rPr>
           <w:rFonts w:asciiTheme="minorBidi" w:hAnsiTheme="minorBidi" w:cstheme="minorBidi"/>
@@ -2763,14 +3321,35 @@
           <w:szCs w:val="28"/>
           <w:shd w:val="clear" w:color="auto" w:fill="F8F9FA"/>
         </w:rPr>
-        <w:t>Tyrosine Kinase</w:t>
-      </w:r>
+        <w:t>Tyrosine</w:t>
+      </w:r>
+      <w:proofErr w:type="spellEnd"/>
       <w:r>
         <w:rPr>
           <w:rFonts w:asciiTheme="minorBidi" w:hAnsiTheme="minorBidi" w:cstheme="minorBidi"/>
           <w:sz w:val="28"/>
           <w:szCs w:val="28"/>
           <w:shd w:val="clear" w:color="auto" w:fill="F8F9FA"/>
+        </w:rPr>
+        <w:t xml:space="preserve"> </w:t>
+      </w:r>
+      <w:proofErr w:type="spellStart"/>
+      <w:r>
+        <w:rPr>
+          <w:rFonts w:asciiTheme="minorBidi" w:hAnsiTheme="minorBidi" w:cstheme="minorBidi"/>
+          <w:sz w:val="28"/>
+          <w:szCs w:val="28"/>
+          <w:shd w:val="clear" w:color="auto" w:fill="F8F9FA"/>
+        </w:rPr>
+        <w:t>Kinase</w:t>
+      </w:r>
+      <w:proofErr w:type="spellEnd"/>
+      <w:r>
+        <w:rPr>
+          <w:rFonts w:asciiTheme="minorBidi" w:hAnsiTheme="minorBidi" w:cstheme="minorBidi"/>
+          <w:sz w:val="28"/>
+          <w:szCs w:val="28"/>
+          <w:shd w:val="clear" w:color="auto" w:fill="F8F9FA"/>
           <w:rtl/>
         </w:rPr>
         <w:t xml:space="preserve"> ב-</w:t>
@@ -2832,6 +3411,7 @@
         </w:rPr>
         <w:t>). כאשר מתרחשת מוטציה בדיוק באזורים הרגישים הללו, המבנה המרחבי של החלבון משתנה כך שהוא נתקע במצב "פועל" (</w:t>
       </w:r>
+      <w:proofErr w:type="spellStart"/>
       <w:r>
         <w:rPr>
           <w:rFonts w:asciiTheme="minorBidi" w:hAnsiTheme="minorBidi" w:cstheme="minorBidi"/>
@@ -2841,6 +3421,7 @@
         </w:rPr>
         <w:t>On</w:t>
       </w:r>
+      <w:proofErr w:type="spellEnd"/>
       <w:r>
         <w:rPr>
           <w:rFonts w:asciiTheme="minorBidi" w:hAnsiTheme="minorBidi" w:cstheme="minorBidi"/>
@@ -2910,6 +3491,7 @@
         </w:rPr>
         <w:t xml:space="preserve"> הוא </w:t>
       </w:r>
+      <w:proofErr w:type="spellStart"/>
       <w:r>
         <w:rPr>
           <w:sz w:val="28"/>
@@ -2917,13 +3499,32 @@
         </w:rPr>
         <w:t>GTPase</w:t>
       </w:r>
-      <w:r>
-        <w:rPr>
-          <w:sz w:val="28"/>
-          <w:szCs w:val="28"/>
-          <w:rtl/>
-        </w:rPr>
-        <w:t xml:space="preserve"> המעורב בהעברת אותות תוך־תאיים הקשורים לגדילה וחלוקה.</w:t>
+      <w:proofErr w:type="spellEnd"/>
+      <w:r>
+        <w:rPr>
+          <w:sz w:val="28"/>
+          <w:szCs w:val="28"/>
+          <w:rtl/>
+        </w:rPr>
+        <w:t xml:space="preserve"> המעורב בהעברת אותות </w:t>
+      </w:r>
+      <w:proofErr w:type="spellStart"/>
+      <w:r>
+        <w:rPr>
+          <w:sz w:val="28"/>
+          <w:szCs w:val="28"/>
+          <w:rtl/>
+        </w:rPr>
+        <w:t>תוך־תאיים</w:t>
+      </w:r>
+      <w:proofErr w:type="spellEnd"/>
+      <w:r>
+        <w:rPr>
+          <w:sz w:val="28"/>
+          <w:szCs w:val="28"/>
+          <w:rtl/>
+        </w:rPr>
+        <w:t xml:space="preserve"> הקשורים לגדילה וחלוקה.</w:t>
       </w:r>
       <w:r>
         <w:rPr>
@@ -2971,64 +3572,634 @@
           <w:szCs w:val="28"/>
           <w:rtl/>
         </w:rPr>
+        <w:t xml:space="preserve">אזורי </w:t>
+      </w:r>
+      <w:proofErr w:type="spellStart"/>
+      <w:r>
+        <w:rPr>
+          <w:sz w:val="28"/>
+          <w:szCs w:val="28"/>
+        </w:rPr>
+        <w:t>Switch</w:t>
+      </w:r>
+      <w:proofErr w:type="spellEnd"/>
+      <w:r>
+        <w:rPr>
+          <w:sz w:val="28"/>
+          <w:szCs w:val="28"/>
+        </w:rPr>
+        <w:t xml:space="preserve"> I</w:t>
+      </w:r>
+      <w:r>
+        <w:rPr>
+          <w:sz w:val="28"/>
+          <w:szCs w:val="28"/>
+          <w:rtl/>
+        </w:rPr>
+        <w:t xml:space="preserve"> ו-</w:t>
+      </w:r>
+      <w:proofErr w:type="spellStart"/>
+      <w:r>
+        <w:rPr>
+          <w:sz w:val="28"/>
+          <w:szCs w:val="28"/>
+        </w:rPr>
+        <w:t>Switch</w:t>
+      </w:r>
+      <w:proofErr w:type="spellEnd"/>
+      <w:r>
+        <w:rPr>
+          <w:sz w:val="28"/>
+          <w:szCs w:val="28"/>
+        </w:rPr>
+        <w:t xml:space="preserve"> II</w:t>
+      </w:r>
+      <w:r>
+        <w:rPr>
+          <w:sz w:val="28"/>
+          <w:szCs w:val="28"/>
+          <w:rtl/>
+        </w:rPr>
+        <w:t xml:space="preserve"> (חשובים להפעלה/כיבוי החלבון)</w:t>
+      </w:r>
+      <w:r>
+        <w:rPr>
+          <w:sz w:val="28"/>
+          <w:szCs w:val="28"/>
+          <w:rtl/>
+        </w:rPr>
+        <w:br/>
+      </w:r>
+    </w:p>
+    <w:p>
+      <w:pPr>
+        <w:bidi/>
+        <w:rPr>
+          <w:rFonts w:hint="cs"/>
+          <w:sz w:val="28"/>
+          <w:szCs w:val="28"/>
+          <w:rtl/>
+        </w:rPr>
+      </w:pPr>
+      <w:r>
+        <w:rPr>
+          <w:sz w:val="28"/>
+          <w:szCs w:val="28"/>
+          <w:rtl/>
+        </w:rPr>
+        <w:t>מוטציות נפוצות (למשל בעמדות 12, 13, 61) פוגעות ביכולת הכיבוי של החלבון וגורמות לפעילות יתר סרטנית.</w:t>
+      </w:r>
+    </w:p>
+    <w:p>
+      <w:pPr>
+        <w:bidi/>
+        <w:rPr>
+          <w:sz w:val="28"/>
+          <w:szCs w:val="28"/>
+          <w:rtl/>
+        </w:rPr>
+      </w:pPr>
+    </w:p>
+    <w:p>
+      <w:pPr>
+        <w:bidi/>
+        <w:rPr>
+          <w:sz w:val="28"/>
+          <w:szCs w:val="28"/>
+          <w:lang w:val="en-US"/>
+        </w:rPr>
+      </w:pPr>
+      <w:r>
+        <w:rPr>
+          <w:sz w:val="28"/>
+          <w:szCs w:val="28"/>
+          <w:rtl/>
+        </w:rPr>
+        <w:t>החלבון</w:t>
+      </w:r>
+      <w:r>
+        <w:rPr>
+          <w:sz w:val="28"/>
+          <w:szCs w:val="28"/>
+          <w:lang w:val="en-US"/>
+        </w:rPr>
+        <w:t xml:space="preserve"> KRAS </w:t>
+      </w:r>
+      <w:r>
+        <w:rPr>
+          <w:sz w:val="28"/>
+          <w:szCs w:val="28"/>
+          <w:rtl/>
+        </w:rPr>
+        <w:t>הוא</w:t>
+      </w:r>
+      <w:r>
+        <w:rPr>
+          <w:sz w:val="28"/>
+          <w:szCs w:val="28"/>
+          <w:lang w:val="en-US"/>
+        </w:rPr>
+        <w:t xml:space="preserve"> GTPase </w:t>
+      </w:r>
+      <w:r>
+        <w:rPr>
+          <w:sz w:val="28"/>
+          <w:szCs w:val="28"/>
+          <w:rtl/>
+        </w:rPr>
+        <w:t>קריטי המתפקד כמתג מולקולרי המעביר אותות לצמיחה וחלוקת תאים. המבנה שלו מחולק לשני חלקים עיקריים, כאשר הראשון הוא ה</w:t>
+      </w:r>
+      <w:r>
+        <w:rPr>
+          <w:sz w:val="28"/>
+          <w:szCs w:val="28"/>
+          <w:lang w:val="en-US"/>
+        </w:rPr>
+        <w:t xml:space="preserve">-G-domain </w:t>
+      </w:r>
+      <w:r>
+        <w:rPr>
+          <w:sz w:val="28"/>
+          <w:szCs w:val="28"/>
+          <w:rtl/>
+        </w:rPr>
+        <w:t>המקיף את שאריות חומצות האמינו 1 עד 166. דומיין זה מהווה את הלב הקטליטי של החלבון ומכיל את אתר הקישור לנוקלאוטידים</w:t>
+      </w:r>
+      <w:r>
+        <w:rPr>
+          <w:sz w:val="28"/>
+          <w:szCs w:val="28"/>
+          <w:lang w:val="en-US"/>
+        </w:rPr>
+        <w:t xml:space="preserve"> GTP </w:t>
+      </w:r>
+      <w:r>
+        <w:rPr>
+          <w:sz w:val="28"/>
+          <w:szCs w:val="28"/>
+          <w:rtl/>
+        </w:rPr>
+        <w:t>ו</w:t>
+      </w:r>
+      <w:r>
+        <w:rPr>
+          <w:sz w:val="28"/>
+          <w:szCs w:val="28"/>
+          <w:lang w:val="en-US"/>
+        </w:rPr>
+        <w:t xml:space="preserve">-GDP. </w:t>
+      </w:r>
+      <w:r>
+        <w:rPr>
+          <w:sz w:val="28"/>
+          <w:szCs w:val="28"/>
+          <w:rtl/>
+        </w:rPr>
+        <w:t>בתוך ה</w:t>
+      </w:r>
+      <w:r>
+        <w:rPr>
+          <w:sz w:val="28"/>
+          <w:szCs w:val="28"/>
+          <w:lang w:val="en-US"/>
+        </w:rPr>
+        <w:t xml:space="preserve">-G-domain </w:t>
+      </w:r>
+      <w:r>
+        <w:rPr>
+          <w:sz w:val="28"/>
+          <w:szCs w:val="28"/>
+          <w:rtl/>
+        </w:rPr>
+        <w:t>נמצא ה</w:t>
+      </w:r>
+      <w:r>
+        <w:rPr>
+          <w:sz w:val="28"/>
+          <w:szCs w:val="28"/>
+          <w:lang w:val="en-US"/>
+        </w:rPr>
+        <w:t xml:space="preserve">-P-loop, </w:t>
+      </w:r>
+      <w:r>
+        <w:rPr>
+          <w:sz w:val="28"/>
+          <w:szCs w:val="28"/>
+          <w:rtl/>
+        </w:rPr>
+        <w:t xml:space="preserve">הממוקם בין שאריות 10 ל-14, שתפקידו המרכזי הוא לייצב את קבוצות הפוספט של הנוקלאוטיד הקשור. מוטציות בנקודה זו, במיוחד בעמדות 12 ו-13, הן מהגורמים השכיחים ביותר להפיכת החלבון </w:t>
+      </w:r>
+      <w:proofErr w:type="spellStart"/>
+      <w:r>
+        <w:rPr>
+          <w:sz w:val="28"/>
+          <w:szCs w:val="28"/>
+          <w:rtl/>
+        </w:rPr>
+        <w:t>לאונקוגני</w:t>
+      </w:r>
+      <w:proofErr w:type="spellEnd"/>
+      <w:r>
+        <w:rPr>
+          <w:sz w:val="28"/>
+          <w:szCs w:val="28"/>
+          <w:lang w:val="en-US"/>
+        </w:rPr>
+        <w:t>.</w:t>
+      </w:r>
+    </w:p>
+    <w:p>
+      <w:pPr>
+        <w:bidi/>
+        <w:rPr>
+          <w:sz w:val="28"/>
+          <w:szCs w:val="28"/>
+          <w:lang w:val="en-US"/>
+        </w:rPr>
+      </w:pPr>
+      <w:r>
+        <w:rPr>
+          <w:sz w:val="28"/>
+          <w:szCs w:val="28"/>
+          <w:rtl/>
+        </w:rPr>
+        <w:t>לצד ה</w:t>
+      </w:r>
+      <w:r>
+        <w:rPr>
+          <w:sz w:val="28"/>
+          <w:szCs w:val="28"/>
+          <w:lang w:val="en-US"/>
+        </w:rPr>
+        <w:t xml:space="preserve">-P-loop, </w:t>
+      </w:r>
+      <w:r>
+        <w:rPr>
+          <w:sz w:val="28"/>
+          <w:szCs w:val="28"/>
+          <w:rtl/>
+        </w:rPr>
+        <w:t>ה</w:t>
+      </w:r>
+      <w:r>
+        <w:rPr>
+          <w:sz w:val="28"/>
+          <w:szCs w:val="28"/>
+          <w:lang w:val="en-US"/>
+        </w:rPr>
+        <w:t xml:space="preserve">-G-domain </w:t>
+      </w:r>
+      <w:r>
+        <w:rPr>
+          <w:sz w:val="28"/>
+          <w:szCs w:val="28"/>
+          <w:rtl/>
+        </w:rPr>
+        <w:t>כולל שני אזורים דינמיים המכונים</w:t>
+      </w:r>
+      <w:r>
+        <w:rPr>
+          <w:sz w:val="28"/>
+          <w:szCs w:val="28"/>
+          <w:lang w:val="en-US"/>
+        </w:rPr>
+        <w:t xml:space="preserve"> Switch I </w:t>
+      </w:r>
+      <w:r>
+        <w:rPr>
+          <w:sz w:val="28"/>
+          <w:szCs w:val="28"/>
+          <w:rtl/>
+        </w:rPr>
+        <w:t>(שאריות 30–40) ו</w:t>
+      </w:r>
+      <w:r>
+        <w:rPr>
+          <w:sz w:val="28"/>
+          <w:szCs w:val="28"/>
+          <w:lang w:val="en-US"/>
+        </w:rPr>
+        <w:t xml:space="preserve">-Switch II </w:t>
+      </w:r>
+      <w:r>
+        <w:rPr>
+          <w:sz w:val="28"/>
+          <w:szCs w:val="28"/>
+          <w:rtl/>
+        </w:rPr>
+        <w:t>(שאריות 58–72). אזורים אלו משנים את צורתם המרחבית באופן קיצוני כאשר החלבון עובר ממצב כבוי</w:t>
+      </w:r>
+      <w:r>
+        <w:rPr>
+          <w:sz w:val="28"/>
+          <w:szCs w:val="28"/>
+          <w:lang w:val="en-US"/>
+        </w:rPr>
+        <w:t xml:space="preserve"> (</w:t>
+      </w:r>
+      <w:r>
+        <w:rPr>
+          <w:sz w:val="28"/>
+          <w:szCs w:val="28"/>
+          <w:rtl/>
+        </w:rPr>
+        <w:t>קשור ל</w:t>
+      </w:r>
+      <w:r>
+        <w:rPr>
+          <w:sz w:val="28"/>
+          <w:szCs w:val="28"/>
+          <w:lang w:val="en-US"/>
+        </w:rPr>
+        <w:t xml:space="preserve">-GDP) </w:t>
+      </w:r>
+      <w:r>
+        <w:rPr>
+          <w:sz w:val="28"/>
+          <w:szCs w:val="28"/>
+          <w:rtl/>
+        </w:rPr>
+        <w:t>למצב פעיל</w:t>
+      </w:r>
+      <w:r>
+        <w:rPr>
+          <w:sz w:val="28"/>
+          <w:szCs w:val="28"/>
+          <w:lang w:val="en-US"/>
+        </w:rPr>
+        <w:t xml:space="preserve"> (</w:t>
+      </w:r>
+      <w:r>
+        <w:rPr>
+          <w:sz w:val="28"/>
+          <w:szCs w:val="28"/>
+          <w:rtl/>
+        </w:rPr>
+        <w:t>קשור ל</w:t>
+      </w:r>
+      <w:r>
+        <w:rPr>
+          <w:sz w:val="28"/>
+          <w:szCs w:val="28"/>
+          <w:lang w:val="en-US"/>
+        </w:rPr>
+        <w:t xml:space="preserve">-GTP). </w:t>
+      </w:r>
+      <w:r>
+        <w:rPr>
+          <w:sz w:val="28"/>
+          <w:szCs w:val="28"/>
+          <w:rtl/>
+        </w:rPr>
+        <w:t>שינוי המבנה מאפשר ל</w:t>
+      </w:r>
+      <w:r>
+        <w:rPr>
+          <w:sz w:val="28"/>
+          <w:szCs w:val="28"/>
+          <w:lang w:val="en-US"/>
+        </w:rPr>
+        <w:t xml:space="preserve">-KRAS </w:t>
+      </w:r>
+      <w:r>
+        <w:rPr>
+          <w:sz w:val="28"/>
+          <w:szCs w:val="28"/>
+          <w:rtl/>
+        </w:rPr>
+        <w:t>לגייס ולהפעיל חלבוני מטרה במורד הזרם, כמו</w:t>
+      </w:r>
+      <w:r>
+        <w:rPr>
+          <w:sz w:val="28"/>
+          <w:szCs w:val="28"/>
+          <w:lang w:val="en-US"/>
+        </w:rPr>
+        <w:t xml:space="preserve"> RAF </w:t>
+      </w:r>
+      <w:r>
+        <w:rPr>
+          <w:sz w:val="28"/>
+          <w:szCs w:val="28"/>
+          <w:rtl/>
+        </w:rPr>
+        <w:t>או</w:t>
+      </w:r>
+      <w:r>
+        <w:rPr>
+          <w:sz w:val="28"/>
+          <w:szCs w:val="28"/>
+          <w:lang w:val="en-US"/>
+        </w:rPr>
+        <w:t xml:space="preserve"> PI3K. </w:t>
+      </w:r>
+      <w:r>
+        <w:rPr>
+          <w:sz w:val="28"/>
+          <w:szCs w:val="28"/>
+          <w:rtl/>
+        </w:rPr>
+        <w:t>מוטציה נפוצה נוספת מתרחשת בעמדה 61 שנמצאת בתוך</w:t>
+      </w:r>
+      <w:r>
+        <w:rPr>
+          <w:sz w:val="28"/>
+          <w:szCs w:val="28"/>
+          <w:lang w:val="en-US"/>
+        </w:rPr>
+        <w:t xml:space="preserve"> Switch II; </w:t>
+      </w:r>
+      <w:r>
+        <w:rPr>
+          <w:sz w:val="28"/>
+          <w:szCs w:val="28"/>
+          <w:rtl/>
+        </w:rPr>
+        <w:t xml:space="preserve">מוטציה זו פוגעת ביכולת ההידרוליזה של החלבון, כלומר ביכולתו לפרק </w:t>
+      </w:r>
+      <w:r>
+        <w:rPr>
+          <w:sz w:val="28"/>
+          <w:szCs w:val="28"/>
+          <w:rtl/>
+        </w:rPr>
         <w:lastRenderedPageBreak/>
-        <w:t xml:space="preserve">אזורי </w:t>
-      </w:r>
-      <w:r>
-        <w:rPr>
-          <w:sz w:val="28"/>
-          <w:szCs w:val="28"/>
-        </w:rPr>
-        <w:t>Switch I</w:t>
-      </w:r>
-      <w:r>
-        <w:rPr>
-          <w:sz w:val="28"/>
-          <w:szCs w:val="28"/>
-          <w:rtl/>
-        </w:rPr>
-        <w:t xml:space="preserve"> ו-</w:t>
-      </w:r>
-      <w:r>
-        <w:rPr>
-          <w:sz w:val="28"/>
-          <w:szCs w:val="28"/>
-        </w:rPr>
-        <w:t>Switch II</w:t>
-      </w:r>
-      <w:r>
-        <w:rPr>
-          <w:sz w:val="28"/>
-          <w:szCs w:val="28"/>
-          <w:rtl/>
-        </w:rPr>
-        <w:t xml:space="preserve"> (חשובים להפעלה/כיבוי החלבון)</w:t>
-      </w:r>
-      <w:r>
-        <w:rPr>
-          <w:sz w:val="28"/>
-          <w:szCs w:val="28"/>
-          <w:rtl/>
-        </w:rPr>
-        <w:br/>
-      </w:r>
-    </w:p>
-    <w:p>
-      <w:pPr>
-        <w:bidi/>
-        <w:rPr>
-          <w:sz w:val="28"/>
-          <w:szCs w:val="28"/>
-        </w:rPr>
-      </w:pPr>
-      <w:r>
-        <w:rPr>
-          <w:sz w:val="28"/>
-          <w:szCs w:val="28"/>
-          <w:rtl/>
-        </w:rPr>
-        <w:t>מוטציות נפוצות (למשל בעמדות 12, 13, 61) פוגעות ביכולת הכיבוי של החלבון וגורמות לפעילות יתר סרטנית.</w:t>
-      </w:r>
+        <w:t>את ה</w:t>
+      </w:r>
+      <w:r>
+        <w:rPr>
+          <w:sz w:val="28"/>
+          <w:szCs w:val="28"/>
+          <w:lang w:val="en-US"/>
+        </w:rPr>
+        <w:t xml:space="preserve">-GTP </w:t>
+      </w:r>
+      <w:r>
+        <w:rPr>
+          <w:sz w:val="28"/>
+          <w:szCs w:val="28"/>
+          <w:rtl/>
+        </w:rPr>
+        <w:t>ולכבות את עצמו, מה שמוביל לשליחת אותות גדילה בלתי פוסקים לגרעין התא</w:t>
+      </w:r>
+      <w:r>
+        <w:rPr>
+          <w:sz w:val="28"/>
+          <w:szCs w:val="28"/>
+          <w:lang w:val="en-US"/>
+        </w:rPr>
+        <w:t>.</w:t>
+      </w:r>
+    </w:p>
+    <w:p>
+      <w:pPr>
+        <w:bidi/>
+        <w:rPr>
+          <w:sz w:val="28"/>
+          <w:szCs w:val="28"/>
+          <w:lang w:val="en-US"/>
+        </w:rPr>
+      </w:pPr>
+      <w:r>
+        <w:rPr>
+          <w:sz w:val="28"/>
+          <w:szCs w:val="28"/>
+          <w:rtl/>
+        </w:rPr>
+        <w:t>החלק השני של החלבון הוא ה</w:t>
+      </w:r>
+      <w:r>
+        <w:rPr>
+          <w:sz w:val="28"/>
+          <w:szCs w:val="28"/>
+          <w:lang w:val="en-US"/>
+        </w:rPr>
+        <w:t xml:space="preserve">-Hypervariable Region, </w:t>
+      </w:r>
+      <w:r>
+        <w:rPr>
+          <w:sz w:val="28"/>
+          <w:szCs w:val="28"/>
+          <w:rtl/>
+        </w:rPr>
+        <w:t>או בקיצור</w:t>
+      </w:r>
+      <w:r>
+        <w:rPr>
+          <w:sz w:val="28"/>
+          <w:szCs w:val="28"/>
+          <w:lang w:val="en-US"/>
+        </w:rPr>
+        <w:t xml:space="preserve"> HVR, </w:t>
+      </w:r>
+      <w:r>
+        <w:rPr>
+          <w:sz w:val="28"/>
+          <w:szCs w:val="28"/>
+          <w:rtl/>
+        </w:rPr>
+        <w:t>המשתרע משארית 167 ועד סוף הרצף בשארית 189. בניגוד ל</w:t>
+      </w:r>
+      <w:r>
+        <w:rPr>
+          <w:sz w:val="28"/>
+          <w:szCs w:val="28"/>
+          <w:lang w:val="en-US"/>
+        </w:rPr>
+        <w:t xml:space="preserve">-G-domain </w:t>
+      </w:r>
+      <w:r>
+        <w:rPr>
+          <w:sz w:val="28"/>
+          <w:szCs w:val="28"/>
+          <w:rtl/>
+        </w:rPr>
+        <w:t>היציב, ה</w:t>
+      </w:r>
+      <w:r>
+        <w:rPr>
+          <w:sz w:val="28"/>
+          <w:szCs w:val="28"/>
+          <w:lang w:val="en-US"/>
+        </w:rPr>
+        <w:t xml:space="preserve">-HVR </w:t>
+      </w:r>
+      <w:r>
+        <w:rPr>
+          <w:sz w:val="28"/>
+          <w:szCs w:val="28"/>
+          <w:rtl/>
+        </w:rPr>
+        <w:t>הוא אזור גמיש ובלתי מקופל שתפקידו העיקרי הוא עיגון החלבון לממברנת התא, שם מתרחשת עיקר פעילותו. בקצה המרוחק של ה</w:t>
+      </w:r>
+      <w:r>
+        <w:rPr>
+          <w:sz w:val="28"/>
+          <w:szCs w:val="28"/>
+          <w:lang w:val="en-US"/>
+        </w:rPr>
+        <w:t xml:space="preserve">-HVR </w:t>
+      </w:r>
+      <w:r>
+        <w:rPr>
+          <w:sz w:val="28"/>
+          <w:szCs w:val="28"/>
+          <w:rtl/>
+        </w:rPr>
+        <w:t>נמצא רצף ה</w:t>
+      </w:r>
+      <w:r>
+        <w:rPr>
+          <w:sz w:val="28"/>
+          <w:szCs w:val="28"/>
+          <w:lang w:val="en-US"/>
+        </w:rPr>
+        <w:t xml:space="preserve">-CAAX </w:t>
+      </w:r>
+      <w:r>
+        <w:rPr>
+          <w:sz w:val="28"/>
+          <w:szCs w:val="28"/>
+          <w:rtl/>
+        </w:rPr>
+        <w:t xml:space="preserve">(שאריות 185–188), המשמש כאתר למודיפיקציות כימיות לאחר תרגום החלבון. בתהליך זה מתווספת קבוצה שומנית לשארית </w:t>
+      </w:r>
+      <w:proofErr w:type="spellStart"/>
+      <w:r>
+        <w:rPr>
+          <w:sz w:val="28"/>
+          <w:szCs w:val="28"/>
+          <w:rtl/>
+        </w:rPr>
+        <w:t>הציסטאין</w:t>
+      </w:r>
+      <w:proofErr w:type="spellEnd"/>
+      <w:r>
+        <w:rPr>
+          <w:sz w:val="28"/>
+          <w:szCs w:val="28"/>
+          <w:rtl/>
+        </w:rPr>
+        <w:t xml:space="preserve"> בעמדה 185, מה שמעניק לחלבון את ה"עוגן" הדרוש לו כדי להיצמד לממברנה ולהשתלב במסלולי העברת האותות התאיים</w:t>
+      </w:r>
+      <w:r>
+        <w:rPr>
+          <w:sz w:val="28"/>
+          <w:szCs w:val="28"/>
+          <w:lang w:val="en-US"/>
+        </w:rPr>
+        <w:t>.</w:t>
+      </w:r>
+    </w:p>
+    <w:p>
+      <w:pPr>
+        <w:bidi/>
+        <w:rPr>
+          <w:sz w:val="28"/>
+          <w:szCs w:val="28"/>
+          <w:lang w:val="en-US"/>
+        </w:rPr>
+      </w:pPr>
     </w:p>
     <w:p>
       <w:pPr>
@@ -3096,15 +4267,85 @@
           <w:szCs w:val="28"/>
           <w:rtl/>
         </w:rPr>
-        <w:t xml:space="preserve"> הוא קולטן טירוזין קינאז (</w:t>
-      </w:r>
-      <w:r>
-        <w:rPr>
-          <w:sz w:val="28"/>
-          <w:szCs w:val="28"/>
-        </w:rPr>
-        <w:t>Receptor Tyrosine Kinase</w:t>
-      </w:r>
+        <w:t xml:space="preserve"> הוא קולטן </w:t>
+      </w:r>
+      <w:proofErr w:type="spellStart"/>
+      <w:r>
+        <w:rPr>
+          <w:sz w:val="28"/>
+          <w:szCs w:val="28"/>
+          <w:rtl/>
+        </w:rPr>
+        <w:t>טירוזין</w:t>
+      </w:r>
+      <w:proofErr w:type="spellEnd"/>
+      <w:r>
+        <w:rPr>
+          <w:sz w:val="28"/>
+          <w:szCs w:val="28"/>
+          <w:rtl/>
+        </w:rPr>
+        <w:t xml:space="preserve"> </w:t>
+      </w:r>
+      <w:proofErr w:type="spellStart"/>
+      <w:r>
+        <w:rPr>
+          <w:sz w:val="28"/>
+          <w:szCs w:val="28"/>
+          <w:rtl/>
+        </w:rPr>
+        <w:t>קינאז</w:t>
+      </w:r>
+      <w:proofErr w:type="spellEnd"/>
+      <w:r>
+        <w:rPr>
+          <w:sz w:val="28"/>
+          <w:szCs w:val="28"/>
+          <w:rtl/>
+        </w:rPr>
+        <w:t xml:space="preserve"> (</w:t>
+      </w:r>
+      <w:proofErr w:type="spellStart"/>
+      <w:r>
+        <w:rPr>
+          <w:sz w:val="28"/>
+          <w:szCs w:val="28"/>
+        </w:rPr>
+        <w:t>Receptor</w:t>
+      </w:r>
+      <w:proofErr w:type="spellEnd"/>
+      <w:r>
+        <w:rPr>
+          <w:sz w:val="28"/>
+          <w:szCs w:val="28"/>
+        </w:rPr>
+        <w:t xml:space="preserve"> </w:t>
+      </w:r>
+      <w:proofErr w:type="spellStart"/>
+      <w:r>
+        <w:rPr>
+          <w:sz w:val="28"/>
+          <w:szCs w:val="28"/>
+        </w:rPr>
+        <w:t>Tyrosine</w:t>
+      </w:r>
+      <w:proofErr w:type="spellEnd"/>
+      <w:r>
+        <w:rPr>
+          <w:sz w:val="28"/>
+          <w:szCs w:val="28"/>
+        </w:rPr>
+        <w:t xml:space="preserve"> </w:t>
+      </w:r>
+      <w:proofErr w:type="spellStart"/>
+      <w:r>
+        <w:rPr>
+          <w:sz w:val="28"/>
+          <w:szCs w:val="28"/>
+        </w:rPr>
+        <w:t>Kinase</w:t>
+      </w:r>
+      <w:proofErr w:type="spellEnd"/>
       <w:r>
         <w:rPr>
           <w:sz w:val="28"/>
@@ -3128,60 +4369,126 @@
           <w:szCs w:val="28"/>
           <w:rtl/>
         </w:rPr>
-        <w:t>הוא כולל מספר דומיינים:</w:t>
-      </w:r>
-    </w:p>
-    <w:p>
-      <w:pPr>
-        <w:bidi/>
-        <w:rPr>
-          <w:sz w:val="28"/>
-          <w:szCs w:val="28"/>
-        </w:rPr>
-      </w:pPr>
-      <w:r>
-        <w:rPr>
-          <w:sz w:val="28"/>
-          <w:szCs w:val="28"/>
-          <w:rtl/>
-        </w:rPr>
-        <w:t>דומיין חוץ-תאי לקישור ליגנד</w:t>
-      </w:r>
-    </w:p>
-    <w:p>
-      <w:pPr>
-        <w:bidi/>
-        <w:rPr>
-          <w:sz w:val="28"/>
-          <w:szCs w:val="28"/>
-        </w:rPr>
-      </w:pPr>
-      <w:r>
-        <w:rPr>
-          <w:sz w:val="28"/>
-          <w:szCs w:val="28"/>
-          <w:rtl/>
-        </w:rPr>
-        <w:t>דומיין טרנסממברנלי</w:t>
-      </w:r>
-    </w:p>
-    <w:p>
-      <w:pPr>
-        <w:bidi/>
-        <w:rPr>
-          <w:sz w:val="28"/>
-          <w:szCs w:val="28"/>
-          <w:rtl/>
-        </w:rPr>
-      </w:pPr>
-      <w:r>
-        <w:rPr>
-          <w:sz w:val="28"/>
-          <w:szCs w:val="28"/>
-          <w:rtl/>
-        </w:rPr>
-        <w:t>דומיין קינאז תוך־תאי</w:t>
-      </w:r>
+        <w:t xml:space="preserve">הוא כולל מספר </w:t>
+      </w:r>
+      <w:proofErr w:type="spellStart"/>
+      <w:r>
+        <w:rPr>
+          <w:sz w:val="28"/>
+          <w:szCs w:val="28"/>
+          <w:rtl/>
+        </w:rPr>
+        <w:t>דומיינים</w:t>
+      </w:r>
+      <w:proofErr w:type="spellEnd"/>
+      <w:r>
+        <w:rPr>
+          <w:sz w:val="28"/>
+          <w:szCs w:val="28"/>
+          <w:rtl/>
+        </w:rPr>
+        <w:t>:</w:t>
+      </w:r>
+    </w:p>
+    <w:p>
+      <w:pPr>
+        <w:bidi/>
+        <w:rPr>
+          <w:sz w:val="28"/>
+          <w:szCs w:val="28"/>
+        </w:rPr>
+      </w:pPr>
+      <w:r>
+        <w:rPr>
+          <w:sz w:val="28"/>
+          <w:szCs w:val="28"/>
+          <w:rtl/>
+        </w:rPr>
+        <w:t xml:space="preserve">דומיין חוץ-תאי לקישור </w:t>
+      </w:r>
+      <w:proofErr w:type="spellStart"/>
+      <w:r>
+        <w:rPr>
+          <w:sz w:val="28"/>
+          <w:szCs w:val="28"/>
+          <w:rtl/>
+        </w:rPr>
+        <w:t>ליגנד</w:t>
+      </w:r>
+      <w:proofErr w:type="spellEnd"/>
+    </w:p>
+    <w:p>
+      <w:pPr>
+        <w:bidi/>
+        <w:rPr>
+          <w:sz w:val="28"/>
+          <w:szCs w:val="28"/>
+        </w:rPr>
+      </w:pPr>
+      <w:r>
+        <w:rPr>
+          <w:sz w:val="28"/>
+          <w:szCs w:val="28"/>
+          <w:rtl/>
+        </w:rPr>
+        <w:t xml:space="preserve">דומיין </w:t>
+      </w:r>
+      <w:proofErr w:type="spellStart"/>
+      <w:r>
+        <w:rPr>
+          <w:sz w:val="28"/>
+          <w:szCs w:val="28"/>
+          <w:rtl/>
+        </w:rPr>
+        <w:t>טרנסממברנלי</w:t>
+      </w:r>
+      <w:proofErr w:type="spellEnd"/>
+    </w:p>
+    <w:p>
+      <w:pPr>
+        <w:bidi/>
+        <w:rPr>
+          <w:sz w:val="28"/>
+          <w:szCs w:val="28"/>
+          <w:rtl/>
+        </w:rPr>
+      </w:pPr>
+      <w:r>
+        <w:rPr>
+          <w:sz w:val="28"/>
+          <w:szCs w:val="28"/>
+          <w:rtl/>
+        </w:rPr>
+        <w:t xml:space="preserve">דומיין </w:t>
+      </w:r>
+      <w:proofErr w:type="spellStart"/>
+      <w:r>
+        <w:rPr>
+          <w:sz w:val="28"/>
+          <w:szCs w:val="28"/>
+          <w:rtl/>
+        </w:rPr>
+        <w:t>קינאז</w:t>
+      </w:r>
+      <w:proofErr w:type="spellEnd"/>
+      <w:r>
+        <w:rPr>
+          <w:sz w:val="28"/>
+          <w:szCs w:val="28"/>
+          <w:rtl/>
+        </w:rPr>
+        <w:t xml:space="preserve"> </w:t>
+      </w:r>
+      <w:proofErr w:type="spellStart"/>
+      <w:r>
+        <w:rPr>
+          <w:sz w:val="28"/>
+          <w:szCs w:val="28"/>
+          <w:rtl/>
+        </w:rPr>
+        <w:t>תוך־תאי</w:t>
+      </w:r>
+      <w:proofErr w:type="spellEnd"/>
     </w:p>
     <w:p>
       <w:pPr>
@@ -3208,7 +4515,43 @@
           <w:szCs w:val="28"/>
           <w:rtl/>
         </w:rPr>
-        <w:t>מוטציות סרטניות רבות מתרחשות בדומיין הקינאז וגורמות להפעלה קבועה של אותות גדילה.</w:t>
+        <w:t xml:space="preserve">מוטציות סרטניות רבות מתרחשות </w:t>
+      </w:r>
+      <w:proofErr w:type="spellStart"/>
+      <w:r>
+        <w:rPr>
+          <w:sz w:val="28"/>
+          <w:szCs w:val="28"/>
+          <w:rtl/>
+        </w:rPr>
+        <w:t>בדומיין</w:t>
+      </w:r>
+      <w:proofErr w:type="spellEnd"/>
+      <w:r>
+        <w:rPr>
+          <w:sz w:val="28"/>
+          <w:szCs w:val="28"/>
+          <w:rtl/>
+        </w:rPr>
+        <w:t xml:space="preserve"> </w:t>
+      </w:r>
+      <w:proofErr w:type="spellStart"/>
+      <w:r>
+        <w:rPr>
+          <w:sz w:val="28"/>
+          <w:szCs w:val="28"/>
+          <w:rtl/>
+        </w:rPr>
+        <w:t>הקינאז</w:t>
+      </w:r>
+      <w:proofErr w:type="spellEnd"/>
+      <w:r>
+        <w:rPr>
+          <w:sz w:val="28"/>
+          <w:szCs w:val="28"/>
+          <w:rtl/>
+        </w:rPr>
+        <w:t xml:space="preserve"> וגורמות להפעלה קבועה של אותות גדילה.</w:t>
       </w:r>
     </w:p>
     <w:p>
@@ -3359,9 +4702,19 @@
         </w:rPr>
         <w:t>. הגדרת המבנה (</w:t>
       </w:r>
-      <w:r>
-        <w:t>Data Structures</w:t>
-      </w:r>
+      <w:proofErr w:type="spellStart"/>
+      <w:r>
+        <w:t>Data</w:t>
+      </w:r>
+      <w:proofErr w:type="spellEnd"/>
+      <w:r>
+        <w:t xml:space="preserve"> </w:t>
+      </w:r>
+      <w:proofErr w:type="spellStart"/>
+      <w:r>
+        <w:t>Structures</w:t>
+      </w:r>
+      <w:proofErr w:type="spellEnd"/>
       <w:r>
         <w:rPr>
           <w:rtl/>
@@ -3389,6 +4742,7 @@
         </w:rPr>
         <w:t xml:space="preserve">לפני הפונקציות, הגדרת שני מילונים: </w:t>
       </w:r>
+      <w:proofErr w:type="spellStart"/>
       <w:r>
         <w:rPr>
           <w:sz w:val="28"/>
@@ -3397,6 +4751,7 @@
         </w:rPr>
         <w:t>EGFR_domains</w:t>
       </w:r>
+      <w:proofErr w:type="spellEnd"/>
       <w:r>
         <w:rPr>
           <w:rFonts w:hint="cs"/>
@@ -3407,6 +4762,7 @@
         </w:rPr>
         <w:t xml:space="preserve"> ו-</w:t>
       </w:r>
+      <w:proofErr w:type="spellStart"/>
       <w:r>
         <w:rPr>
           <w:sz w:val="28"/>
@@ -3415,6 +4771,7 @@
         </w:rPr>
         <w:t>KRAS_domains</w:t>
       </w:r>
+      <w:proofErr w:type="spellEnd"/>
       <w:r>
         <w:rPr>
           <w:rFonts w:hint="cs"/>
@@ -3457,6 +4814,7 @@
           <w:rFonts w:hint="cs"/>
           <w:rtl/>
         </w:rPr>
+        <w:lastRenderedPageBreak/>
         <w:t xml:space="preserve">3. </w:t>
       </w:r>
       <w:r>
@@ -3489,6 +4847,7 @@
         </w:rPr>
         <w:t xml:space="preserve">פונקציית חילוץ המוטציות: </w:t>
       </w:r>
+      <w:proofErr w:type="spellStart"/>
       <w:r>
         <w:rPr>
           <w:b/>
@@ -3498,6 +4857,7 @@
         </w:rPr>
         <w:t>get_list_of_all_protein_changes</w:t>
       </w:r>
+      <w:proofErr w:type="spellEnd"/>
     </w:p>
     <w:p>
       <w:pPr>
@@ -3562,7 +4922,6 @@
           <w:szCs w:val="28"/>
           <w:rtl/>
         </w:rPr>
-        <w:lastRenderedPageBreak/>
         <w:t xml:space="preserve">התוצאה: רשימה נקייה של שמות מוטציות (למשל: </w:t>
       </w:r>
       <w:r>
@@ -3612,6 +4971,7 @@
         </w:rPr>
         <w:t xml:space="preserve">פונקציית המרת טקסט למספרים: </w:t>
       </w:r>
+      <w:proofErr w:type="spellStart"/>
       <w:r>
         <w:rPr>
           <w:rFonts w:eastAsia="Roboto Mono"/>
@@ -3622,6 +4982,7 @@
         </w:rPr>
         <w:t>get_mutation_indices</w:t>
       </w:r>
+      <w:proofErr w:type="spellEnd"/>
     </w:p>
     <w:p>
       <w:pPr>
@@ -3639,6 +5000,7 @@
         </w:rPr>
         <w:t>מה היא עושה: משתמשת ב"ביטויים רגולריים" (</w:t>
       </w:r>
+      <w:proofErr w:type="spellStart"/>
       <w:r>
         <w:rPr>
           <w:rFonts w:eastAsia="Roboto Mono"/>
@@ -3647,6 +5009,7 @@
         </w:rPr>
         <w:t>re</w:t>
       </w:r>
+      <w:proofErr w:type="spellEnd"/>
       <w:r>
         <w:rPr>
           <w:sz w:val="28"/>
@@ -3787,6 +5150,7 @@
         </w:rPr>
         <w:t xml:space="preserve">פונקציית הספירה והשיוך: </w:t>
       </w:r>
+      <w:proofErr w:type="spellStart"/>
       <w:r>
         <w:rPr>
           <w:rFonts w:eastAsia="Roboto Mono"/>
@@ -3797,6 +5161,7 @@
         </w:rPr>
         <w:t>update_domain_counts</w:t>
       </w:r>
+      <w:proofErr w:type="spellEnd"/>
     </w:p>
     <w:p>
       <w:pPr>
@@ -3922,7 +5287,29 @@
           <w:szCs w:val="28"/>
           <w:rtl/>
         </w:rPr>
-        <w:t>חיבור של הכל ביחד</w:t>
+        <w:t xml:space="preserve">חיבור של </w:t>
+      </w:r>
+      <w:proofErr w:type="spellStart"/>
+      <w:r>
+        <w:rPr>
+          <w:b/>
+          <w:bCs/>
+          <w:sz w:val="28"/>
+          <w:szCs w:val="28"/>
+          <w:rtl/>
+        </w:rPr>
+        <w:t>הכל</w:t>
+      </w:r>
+      <w:proofErr w:type="spellEnd"/>
+      <w:r>
+        <w:rPr>
+          <w:b/>
+          <w:bCs/>
+          <w:sz w:val="28"/>
+          <w:szCs w:val="28"/>
+          <w:rtl/>
+        </w:rPr>
+        <w:t xml:space="preserve"> ביחד</w:t>
       </w:r>
     </w:p>
     <w:p>
@@ -4089,6 +5476,7 @@
           <w:szCs w:val="28"/>
         </w:rPr>
       </w:pPr>
+      <w:proofErr w:type="spellStart"/>
       <w:r>
         <w:rPr>
           <w:sz w:val="28"/>
@@ -4096,6 +5484,7 @@
         </w:rPr>
         <w:t>UniProt</w:t>
       </w:r>
+      <w:proofErr w:type="spellEnd"/>
       <w:r>
         <w:rPr>
           <w:sz w:val="28"/>
@@ -4112,6 +5501,7 @@
         </w:rPr>
         <w:br/>
       </w:r>
+      <w:proofErr w:type="spellStart"/>
       <w:r>
         <w:rPr>
           <w:sz w:val="28"/>
@@ -4119,6 +5509,7 @@
         </w:rPr>
         <w:t>cbioportal</w:t>
       </w:r>
+      <w:proofErr w:type="spellEnd"/>
       <w:r>
         <w:rPr>
           <w:sz w:val="28"/>
@@ -4161,7 +5552,6 @@
           <w:shd w:val="clear" w:color="auto" w:fill="F8F9FA"/>
           <w:rtl/>
         </w:rPr>
-        <w:lastRenderedPageBreak/>
         <w:t xml:space="preserve">ניתוח התוצאות </w:t>
       </w:r>
     </w:p>
@@ -4192,8 +5582,9 @@
           <w:rtl/>
           <w:lang w:val="en-US"/>
         </w:rPr>
-        <w:t xml:space="preserve">ת כמות המוטציות בכל דומיין, אנחנו נצטרך לבדוק לאיזה דומיינים יש </w:t>
-      </w:r>
+        <w:t xml:space="preserve">ת כמות המוטציות בכל דומיין, אנחנו נצטרך לבדוק לאיזה </w:t>
+      </w:r>
+      <w:proofErr w:type="spellStart"/>
       <w:r>
         <w:rPr>
           <w:rFonts w:hint="cs"/>
@@ -4202,6 +5593,27 @@
           <w:rtl/>
           <w:lang w:val="en-US"/>
         </w:rPr>
+        <w:t>דומיינים</w:t>
+      </w:r>
+      <w:proofErr w:type="spellEnd"/>
+      <w:r>
+        <w:rPr>
+          <w:rFonts w:hint="cs"/>
+          <w:sz w:val="28"/>
+          <w:szCs w:val="28"/>
+          <w:rtl/>
+          <w:lang w:val="en-US"/>
+        </w:rPr>
+        <w:t xml:space="preserve"> יש </w:t>
+      </w:r>
+      <w:r>
+        <w:rPr>
+          <w:rFonts w:hint="cs"/>
+          <w:sz w:val="28"/>
+          <w:szCs w:val="28"/>
+          <w:rtl/>
+          <w:lang w:val="en-US"/>
+        </w:rPr>
         <w:t>כמות מוטציות חריגה</w:t>
       </w:r>
       <w:r>
@@ -4416,7 +5828,6 @@
       <w:pPr>
         <w:bidi/>
         <w:rPr>
-          <w:rFonts w:hint="cs"/>
           <w:sz w:val="28"/>
           <w:szCs w:val="28"/>
           <w:rtl/>
@@ -4505,7 +5916,29 @@
           <w:shd w:val="clear" w:color="auto" w:fill="F8F9FA"/>
           <w:rtl/>
         </w:rPr>
-        <w:t>תכנון אופן הולידציה של הקוד והתוצאות</w:t>
+        <w:t xml:space="preserve">תכנון אופן </w:t>
+      </w:r>
+      <w:proofErr w:type="spellStart"/>
+      <w:r>
+        <w:rPr>
+          <w:rFonts w:asciiTheme="minorBidi" w:eastAsia="Alef" w:hAnsiTheme="minorBidi" w:cstheme="minorBidi"/>
+          <w:sz w:val="36"/>
+          <w:szCs w:val="36"/>
+          <w:shd w:val="clear" w:color="auto" w:fill="F8F9FA"/>
+          <w:rtl/>
+        </w:rPr>
+        <w:t>הולידציה</w:t>
+      </w:r>
+      <w:proofErr w:type="spellEnd"/>
+      <w:r>
+        <w:rPr>
+          <w:rFonts w:asciiTheme="minorBidi" w:eastAsia="Alef" w:hAnsiTheme="minorBidi" w:cstheme="minorBidi"/>
+          <w:sz w:val="36"/>
+          <w:szCs w:val="36"/>
+          <w:shd w:val="clear" w:color="auto" w:fill="F8F9FA"/>
+          <w:rtl/>
+        </w:rPr>
+        <w:t xml:space="preserve"> של הקוד והתוצאות</w:t>
       </w:r>
       <w:bookmarkEnd w:id="34"/>
     </w:p>
@@ -4576,6 +6009,7 @@
         </w:rPr>
         <w:t xml:space="preserve">בדיקה של ה </w:t>
       </w:r>
+      <w:proofErr w:type="spellStart"/>
       <w:r>
         <w:rPr>
           <w:sz w:val="28"/>
@@ -4584,6 +6018,7 @@
         </w:rPr>
         <w:t>hotspots</w:t>
       </w:r>
+      <w:proofErr w:type="spellEnd"/>
       <w:r>
         <w:rPr>
           <w:sz w:val="28"/>
@@ -4625,6 +6060,7 @@
         <w:rPr>
           <w:rtl/>
         </w:rPr>
+        <w:lastRenderedPageBreak/>
         <w:t>ביבליוגרפיה</w:t>
       </w:r>
       <w:bookmarkEnd w:id="37"/>
@@ -4676,13 +6112,23 @@
         </w:rPr>
         <w:t>c</w:t>
       </w:r>
-      <w:r>
-        <w:rPr>
-          <w:sz w:val="28"/>
-          <w:szCs w:val="28"/>
-          <w:lang w:val="en-US"/>
-        </w:rPr>
-        <w:t>bioportal-</w:t>
+      <w:proofErr w:type="spellStart"/>
+      <w:r>
+        <w:rPr>
+          <w:sz w:val="28"/>
+          <w:szCs w:val="28"/>
+          <w:lang w:val="en-US"/>
+        </w:rPr>
+        <w:t>bioportal</w:t>
+      </w:r>
+      <w:proofErr w:type="spellEnd"/>
+      <w:r>
+        <w:rPr>
+          <w:sz w:val="28"/>
+          <w:szCs w:val="28"/>
+          <w:lang w:val="en-US"/>
+        </w:rPr>
+        <w:t>-</w:t>
       </w:r>
       <w:hyperlink r:id="rId8" w:history="1">
         <w:r>
@@ -4706,6 +6152,7 @@
           <w:lang w:val="en-US"/>
         </w:rPr>
       </w:pPr>
+      <w:proofErr w:type="gramStart"/>
       <w:r>
         <w:rPr>
           <w:sz w:val="28"/>
@@ -4722,7 +6169,18 @@
           <w:rtl/>
           <w:lang w:val="en-US"/>
         </w:rPr>
-        <w:t>(עדיין לא השתמשנו)</w:t>
+        <w:t>(</w:t>
+      </w:r>
+      <w:proofErr w:type="gramEnd"/>
+      <w:r>
+        <w:rPr>
+          <w:rFonts w:hint="cs"/>
+          <w:sz w:val="28"/>
+          <w:szCs w:val="28"/>
+          <w:rtl/>
+          <w:lang w:val="en-US"/>
+        </w:rPr>
+        <w:t>עדיין לא השתמשנו)</w:t>
       </w:r>
     </w:p>
     <w:p>
@@ -4764,19 +6222,78 @@
       <w:pPr>
         <w:bidi/>
         <w:rPr>
+          <w:rFonts w:asciiTheme="minorBidi" w:eastAsia="Alef" w:hAnsiTheme="minorBidi" w:cstheme="minorBidi"/>
+          <w:sz w:val="36"/>
+          <w:szCs w:val="36"/>
+          <w:shd w:val="clear" w:color="auto" w:fill="F8F9FA"/>
+          <w:lang w:val="en-US"/>
+        </w:rPr>
+      </w:pPr>
+      <w:r>
+        <w:rPr>
           <w:rFonts w:asciiTheme="minorBidi" w:eastAsia="Alef" w:hAnsiTheme="minorBidi" w:cstheme="minorBidi" w:hint="cs"/>
           <w:sz w:val="36"/>
           <w:szCs w:val="36"/>
           <w:shd w:val="clear" w:color="auto" w:fill="F8F9FA"/>
-          <w:lang w:val="en-US"/>
-        </w:rPr>
-      </w:pPr>
-    </w:p>
-    <w:p>
-      <w:pPr>
-        <w:bidi/>
+          <w:rtl/>
+          <w:lang w:val="en-US"/>
+        </w:rPr>
+        <w:t xml:space="preserve">מידע על </w:t>
+      </w:r>
+      <w:r>
         <w:rPr>
           <w:rFonts w:asciiTheme="minorBidi" w:eastAsia="Alef" w:hAnsiTheme="minorBidi" w:cstheme="minorBidi"/>
+          <w:sz w:val="36"/>
+          <w:szCs w:val="36"/>
+          <w:shd w:val="clear" w:color="auto" w:fill="F8F9FA"/>
+          <w:lang w:val="en-US"/>
+        </w:rPr>
+        <w:t>KRAS</w:t>
+      </w:r>
+    </w:p>
+    <w:p>
+      <w:pPr>
+        <w:bidi/>
+        <w:rPr>
+          <w:rFonts w:asciiTheme="minorBidi" w:eastAsia="Alef" w:hAnsiTheme="minorBidi" w:cstheme="minorBidi"/>
+          <w:sz w:val="36"/>
+          <w:szCs w:val="36"/>
+          <w:shd w:val="clear" w:color="auto" w:fill="F8F9FA"/>
+          <w:rtl/>
+          <w:lang w:val="en-US"/>
+        </w:rPr>
+      </w:pPr>
+      <w:hyperlink r:id="rId10" w:history="1">
+        <w:r>
+          <w:rPr>
+            <w:rStyle w:val="Hyperlink"/>
+            <w:rFonts w:asciiTheme="minorBidi" w:eastAsia="Alef" w:hAnsiTheme="minorBidi" w:cstheme="minorBidi"/>
+            <w:sz w:val="36"/>
+            <w:szCs w:val="36"/>
+            <w:shd w:val="clear" w:color="auto" w:fill="F8F9FA"/>
+            <w:lang w:val="en-US"/>
+          </w:rPr>
+          <w:t>https://pmc.ncbi.nlm.nih.gov/articles/PMC6965201</w:t>
+        </w:r>
+        <w:r>
+          <w:rPr>
+            <w:rStyle w:val="Hyperlink"/>
+            <w:rFonts w:asciiTheme="minorBidi" w:eastAsia="Alef" w:hAnsiTheme="minorBidi"/>
+            <w:sz w:val="36"/>
+            <w:szCs w:val="36"/>
+            <w:shd w:val="clear" w:color="auto" w:fill="F8F9FA"/>
+            <w:rtl/>
+            <w:lang w:val="en-US"/>
+          </w:rPr>
+          <w:t>/</w:t>
+        </w:r>
+      </w:hyperlink>
+    </w:p>
+    <w:p>
+      <w:pPr>
+        <w:bidi/>
+        <w:rPr>
+          <w:rFonts w:asciiTheme="minorBidi" w:eastAsia="Alef" w:hAnsiTheme="minorBidi" w:cstheme="minorBidi" w:hint="cs"/>
           <w:sz w:val="36"/>
           <w:szCs w:val="36"/>
           <w:shd w:val="clear" w:color="auto" w:fill="F8F9FA"/>
@@ -6850,7 +8367,6 @@
   <w:style w:type="character" w:default="1" w:styleId="DefaultParagraphFont">
     <w:name w:val="Default Paragraph Font"/>
     <w:uiPriority w:val="1"/>
-    <w:semiHidden/>
     <w:unhideWhenUsed/>
   </w:style>
   <w:style w:type="table" w:default="1" w:styleId="TableNormal">

</xml_diff>